<commit_message>
Auto sync: 2026-01-13 13:54:11
</commit_message>
<xml_diff>
--- a/TABLES/Table2_Outcome_DPP3_no_p.docx
+++ b/TABLES/Table2_Outcome_DPP3_no_p.docx
@@ -36,8 +36,8 @@
       </w:tblPr>
       <w:tblGrid>
         <w:gridCol w:w="5021"/>
-        <w:gridCol w:w="1878"/>
-        <w:gridCol w:w="1878"/>
+        <w:gridCol w:w="1487"/>
+        <w:gridCol w:w="1572"/>
         <w:gridCol w:w="2954"/>
       </w:tblGrid>
       <w:tr>
@@ -265,7 +265,7 @@
       </w:tr>
       <w:tr>
         <w:trPr>
-          <w:trHeight w:val="569" w:hRule="auto"/>
+          <w:trHeight w:val="618" w:hRule="auto"/>
         </w:trPr>
         body 1
         <w:tc>
@@ -318,7 +318,7 @@
                 <w:szCs w:val="22"/>
                 <w:color w:val="000000"/>
               </w:rPr>
-              <w:t xml:space="preserve">n</w:t>
+              <w:t xml:space="preserve">28-day Mortality (%)</w:t>
             </w:r>
           </w:p>
         </w:tc>
@@ -372,7 +372,7 @@
                 <w:szCs w:val="22"/>
                 <w:color w:val="000000"/>
               </w:rPr>
-              <w:t xml:space="preserve">  24</w:t>
+              <w:t xml:space="preserve">   8 (33) </w:t>
             </w:r>
           </w:p>
         </w:tc>
@@ -426,7 +426,7 @@
                 <w:szCs w:val="22"/>
                 <w:color w:val="000000"/>
               </w:rPr>
-              <w:t xml:space="preserve">  23</w:t>
+              <w:t xml:space="preserve">  14 (61) </w:t>
             </w:r>
           </w:p>
         </w:tc>
@@ -480,14 +480,14 @@
                 <w:szCs w:val="22"/>
                 <w:color w:val="000000"/>
               </w:rPr>
-              <w:t xml:space="preserve"/>
+              <w:t xml:space="preserve">+28 [-1 - +52]</w:t>
             </w:r>
           </w:p>
         </w:tc>
       </w:tr>
       <w:tr>
         <w:trPr>
-          <w:trHeight w:val="620" w:hRule="auto"/>
+          <w:trHeight w:val="618" w:hRule="auto"/>
         </w:trPr>
         body 2
         <w:tc>
@@ -540,7 +540,7 @@
                 <w:szCs w:val="22"/>
                 <w:color w:val="000000"/>
               </w:rPr>
-              <w:t xml:space="preserve">ECMO Duration (days)</w:t>
+              <w:t xml:space="preserve">90-day Mortality (%)</w:t>
             </w:r>
           </w:p>
         </w:tc>
@@ -594,7 +594,7 @@
                 <w:szCs w:val="22"/>
                 <w:color w:val="000000"/>
               </w:rPr>
-              <w:t xml:space="preserve"> 5.0 [3.0, 9.2]</w:t>
+              <w:t xml:space="preserve">  11 (46) </w:t>
             </w:r>
           </w:p>
         </w:tc>
@@ -648,7 +648,7 @@
                 <w:szCs w:val="22"/>
                 <w:color w:val="000000"/>
               </w:rPr>
-              <w:t xml:space="preserve"> 7.0 [3.5, 10.0]</w:t>
+              <w:t xml:space="preserve">  16 (70) </w:t>
             </w:r>
           </w:p>
         </w:tc>
@@ -702,7 +702,7 @@
                 <w:szCs w:val="22"/>
                 <w:color w:val="000000"/>
               </w:rPr>
-              <w:t xml:space="preserve">0.0 [-2.0; 3.0]</w:t>
+              <w:t xml:space="preserve">+24 [-5 - +48]</w:t>
             </w:r>
           </w:p>
         </w:tc>
@@ -762,7 +762,7 @@
                 <w:szCs w:val="22"/>
                 <w:color w:val="000000"/>
               </w:rPr>
-              <w:t xml:space="preserve">ECMO Duration in weaned (days)</w:t>
+              <w:t xml:space="preserve">Bridge to LVAD (%)</w:t>
             </w:r>
           </w:p>
         </w:tc>
@@ -816,7 +816,7 @@
                 <w:szCs w:val="22"/>
                 <w:color w:val="000000"/>
               </w:rPr>
-              <w:t xml:space="preserve"> 4.5 [3.0, 6.5]</w:t>
+              <w:t xml:space="preserve">   2 ( 8) </w:t>
             </w:r>
           </w:p>
         </w:tc>
@@ -870,7 +870,7 @@
                 <w:szCs w:val="22"/>
                 <w:color w:val="000000"/>
               </w:rPr>
-              <w:t xml:space="preserve"> 7.0 [4.0, 9.5]</w:t>
+              <w:t xml:space="preserve">   2 ( 9) </w:t>
             </w:r>
           </w:p>
         </w:tc>
@@ -924,7 +924,7 @@
                 <w:szCs w:val="22"/>
                 <w:color w:val="000000"/>
               </w:rPr>
-              <w:t xml:space="preserve">1.7 [-1.0; 6.0]</w:t>
+              <w:t xml:space="preserve">+0 [-17 - +18]</w:t>
             </w:r>
           </w:p>
         </w:tc>
@@ -984,7 +984,7 @@
                 <w:szCs w:val="22"/>
                 <w:color w:val="000000"/>
               </w:rPr>
-              <w:t xml:space="preserve">ECMO Duration in deceased (days)</w:t>
+              <w:t xml:space="preserve">Bridge to Transplant (%)</w:t>
             </w:r>
           </w:p>
         </w:tc>
@@ -1038,7 +1038,7 @@
                 <w:szCs w:val="22"/>
                 <w:color w:val="000000"/>
               </w:rPr>
-              <w:t xml:space="preserve"> 7.0 [4.0, 10.0]</w:t>
+              <w:t xml:space="preserve">   1 ( 4) </w:t>
             </w:r>
           </w:p>
         </w:tc>
@@ -1092,7 +1092,7 @@
                 <w:szCs w:val="22"/>
                 <w:color w:val="000000"/>
               </w:rPr>
-              <w:t xml:space="preserve"> 5.0 [3.0, 7.0]</w:t>
+              <w:t xml:space="preserve">   1 ( 4) </w:t>
             </w:r>
           </w:p>
         </w:tc>
@@ -1146,14 +1146,14 @@
                 <w:szCs w:val="22"/>
                 <w:color w:val="000000"/>
               </w:rPr>
-              <w:t xml:space="preserve">-1.0 [-5.0; 2.0]</w:t>
+              <w:t xml:space="preserve">+0 [-14 - +15]</w:t>
             </w:r>
           </w:p>
         </w:tc>
       </w:tr>
       <w:tr>
         <w:trPr>
-          <w:trHeight w:val="617" w:hRule="auto"/>
+          <w:trHeight w:val="618" w:hRule="auto"/>
         </w:trPr>
         body 5
         <w:tc>
@@ -1206,7 +1206,7 @@
                 <w:szCs w:val="22"/>
                 <w:color w:val="000000"/>
               </w:rPr>
-              <w:t xml:space="preserve">Intra-Aortic Balloon Pump (%)</w:t>
+              <w:t xml:space="preserve">Death in ICU (%)</w:t>
             </w:r>
           </w:p>
         </w:tc>
@@ -1260,7 +1260,7 @@
                 <w:szCs w:val="22"/>
                 <w:color w:val="000000"/>
               </w:rPr>
-              <w:t xml:space="preserve">   6 (60.0) </w:t>
+              <w:t xml:space="preserve">   7 (29) </w:t>
             </w:r>
           </w:p>
         </w:tc>
@@ -1314,7 +1314,7 @@
                 <w:szCs w:val="22"/>
                 <w:color w:val="000000"/>
               </w:rPr>
-              <w:t xml:space="preserve">   5 (45.5) </w:t>
+              <w:t xml:space="preserve">  13 (56) </w:t>
             </w:r>
           </w:p>
         </w:tc>
@@ -1368,7 +1368,7 @@
                 <w:szCs w:val="22"/>
                 <w:color w:val="000000"/>
               </w:rPr>
-              <w:t xml:space="preserve">-14.5 [-51.1; +26.7]</w:t>
+              <w:t xml:space="preserve">+27 [-1 - +52]</w:t>
             </w:r>
           </w:p>
         </w:tc>
@@ -1428,7 +1428,7 @@
                 <w:szCs w:val="22"/>
                 <w:color w:val="000000"/>
               </w:rPr>
-              <w:t xml:space="preserve">Renal Replacement Therapy (%)</w:t>
+              <w:t xml:space="preserve">Duration of Mechanical Ventilation (days)</w:t>
             </w:r>
           </w:p>
         </w:tc>
@@ -1482,7 +1482,7 @@
                 <w:szCs w:val="22"/>
                 <w:color w:val="000000"/>
               </w:rPr>
-              <w:t xml:space="preserve">   2 (20.0) </w:t>
+              <w:t xml:space="preserve"> 3 [2 - 6]</w:t>
             </w:r>
           </w:p>
         </w:tc>
@@ -1536,7 +1536,7 @@
                 <w:szCs w:val="22"/>
                 <w:color w:val="000000"/>
               </w:rPr>
-              <w:t xml:space="preserve">   5 (45.5) </w:t>
+              <w:t xml:space="preserve"> 8 [4 - 16]</w:t>
             </w:r>
           </w:p>
         </w:tc>
@@ -1590,7 +1590,7 @@
                 <w:szCs w:val="22"/>
                 <w:color w:val="000000"/>
               </w:rPr>
-              <w:t xml:space="preserve">+25.5 [-15.4; +57.7]</w:t>
+              <w:t xml:space="preserve">4 [1 - 9]</w:t>
             </w:r>
           </w:p>
         </w:tc>
@@ -1704,7 +1704,7 @@
                 <w:szCs w:val="22"/>
                 <w:color w:val="000000"/>
               </w:rPr>
-              <w:t xml:space="preserve"> 0.0 [0.0, 0.0]</w:t>
+              <w:t xml:space="preserve"> 0 [0 - 0]</w:t>
             </w:r>
           </w:p>
         </w:tc>
@@ -1758,7 +1758,7 @@
                 <w:szCs w:val="22"/>
                 <w:color w:val="000000"/>
               </w:rPr>
-              <w:t xml:space="preserve"> 4.0 [0.0, 8.5]</w:t>
+              <w:t xml:space="preserve"> 4 [0 - 8]</w:t>
             </w:r>
           </w:p>
         </w:tc>
@@ -1812,14 +1812,14 @@
                 <w:szCs w:val="22"/>
                 <w:color w:val="000000"/>
               </w:rPr>
-              <w:t xml:space="preserve">3.0 [1.0; 6.0]</w:t>
+              <w:t xml:space="preserve">3 [1 - 6]</w:t>
             </w:r>
           </w:p>
         </w:tc>
       </w:tr>
       <w:tr>
         <w:trPr>
-          <w:trHeight w:val="618" w:hRule="auto"/>
+          <w:trHeight w:val="620" w:hRule="auto"/>
         </w:trPr>
         body 8
         <w:tc>
@@ -1872,7 +1872,7 @@
                 <w:szCs w:val="22"/>
                 <w:color w:val="000000"/>
               </w:rPr>
-              <w:t xml:space="preserve">Duration of Mechanical Ventilation (days)</w:t>
+              <w:t xml:space="preserve">ECMO Duration (days)</w:t>
             </w:r>
           </w:p>
         </w:tc>
@@ -1926,7 +1926,7 @@
                 <w:szCs w:val="22"/>
                 <w:color w:val="000000"/>
               </w:rPr>
-              <w:t xml:space="preserve"> 3.0 [1.8, 6.2]</w:t>
+              <w:t xml:space="preserve"> 5 [3 - 9]</w:t>
             </w:r>
           </w:p>
         </w:tc>
@@ -1980,7 +1980,7 @@
                 <w:szCs w:val="22"/>
                 <w:color w:val="000000"/>
               </w:rPr>
-              <w:t xml:space="preserve"> 8.0 [3.5, 16.5]</w:t>
+              <w:t xml:space="preserve"> 7 [4 - 10]</w:t>
             </w:r>
           </w:p>
         </w:tc>
@@ -2034,7 +2034,451 @@
                 <w:szCs w:val="22"/>
                 <w:color w:val="000000"/>
               </w:rPr>
-              <w:t xml:space="preserve">4.0 [1.0; 9.0]</w:t>
+              <w:t xml:space="preserve">0 [-2 - 3]</w:t>
+            </w:r>
+          </w:p>
+        </w:tc>
+      </w:tr>
+      <w:tr>
+        <w:trPr>
+          <w:trHeight w:val="620" w:hRule="auto"/>
+        </w:trPr>
+        body 9
+        <w:tc>
+          <w:tcPr>
+            <w:tcBorders>
+              <w:bottom w:val="none" w:sz="0" w:space="0" w:color="000000"/>
+              <w:top w:val="none" w:sz="0" w:space="0" w:color="000000"/>
+              <w:left w:val="none" w:sz="0" w:space="0" w:color="000000"/>
+              <w:right w:val="none" w:sz="0" w:space="0" w:color="000000"/>
+            </w:tcBorders>
+            <w:shd w:val="clear" w:color="auto" w:fill="FFFFFF"/>
+            <w:tcMar>
+              <w:top w:w="0" w:type="dxa"/>
+              <w:bottom w:w="0" w:type="dxa"/>
+              <w:left w:w="0" w:type="dxa"/>
+              <w:right w:w="0" w:type="dxa"/>
+            </w:tcMar>
+            <w:vAlign w:val="center"/>
+          </w:tcPr>
+          <w:p>
+            <w:pPr>
+              <w:jc w:val="left"/>
+              <w:pBdr>
+                <w:bottom w:val="none" w:sz="0" w:space="0" w:color="000000"/>
+                <w:top w:val="none" w:sz="0" w:space="0" w:color="000000"/>
+                <w:left w:val="none" w:sz="0" w:space="0" w:color="000000"/>
+                <w:right w:val="none" w:sz="0" w:space="0" w:color="000000"/>
+              </w:pBdr>
+              <w:spacing w:after="100" w:before="100" w:line="240"/>
+              <w:ind w:left="100" w:right="100" w:firstLine="0" w:firstLineChars="0"/>
+              <w:rPr>
+                <w:rFonts w:ascii="Helvetica" w:hAnsi="Helvetica" w:eastAsia="Helvetica" w:cs="Helvetica"/>
+                <w:i w:val="false"/>
+                <w:b w:val="false"/>
+                <w:u w:val="none"/>
+                <w:strike w:val="false"/>
+                <w:sz w:val="22"/>
+                <w:szCs w:val="22"/>
+                <w:color w:val="000000"/>
+              </w:rPr>
+            </w:pPr>
+            <w:r>
+              <w:rPr>
+                <w:rFonts w:ascii="Helvetica" w:hAnsi="Helvetica" w:eastAsia="Helvetica" w:cs="Helvetica"/>
+                <w:i w:val="false"/>
+                <w:b w:val="false"/>
+                <w:u w:val="none"/>
+                <w:strike w:val="false"/>
+                <w:sz w:val="22"/>
+                <w:szCs w:val="22"/>
+                <w:color w:val="000000"/>
+              </w:rPr>
+              <w:t xml:space="preserve">ECMO Duration in deceased (days)</w:t>
+            </w:r>
+          </w:p>
+        </w:tc>
+        <w:tc>
+          <w:tcPr>
+            <w:tcBorders>
+              <w:bottom w:val="none" w:sz="0" w:space="0" w:color="000000"/>
+              <w:top w:val="none" w:sz="0" w:space="0" w:color="000000"/>
+              <w:left w:val="none" w:sz="0" w:space="0" w:color="000000"/>
+              <w:right w:val="none" w:sz="0" w:space="0" w:color="000000"/>
+            </w:tcBorders>
+            <w:shd w:val="clear" w:color="auto" w:fill="FFFFFF"/>
+            <w:tcMar>
+              <w:top w:w="0" w:type="dxa"/>
+              <w:bottom w:w="0" w:type="dxa"/>
+              <w:left w:w="0" w:type="dxa"/>
+              <w:right w:w="0" w:type="dxa"/>
+            </w:tcMar>
+            <w:vAlign w:val="center"/>
+          </w:tcPr>
+          <w:p>
+            <w:pPr>
+              <w:jc w:val="center"/>
+              <w:pBdr>
+                <w:bottom w:val="none" w:sz="0" w:space="0" w:color="000000"/>
+                <w:top w:val="none" w:sz="0" w:space="0" w:color="000000"/>
+                <w:left w:val="none" w:sz="0" w:space="0" w:color="000000"/>
+                <w:right w:val="none" w:sz="0" w:space="0" w:color="000000"/>
+              </w:pBdr>
+              <w:spacing w:after="100" w:before="100" w:line="240"/>
+              <w:ind w:left="100" w:right="100" w:firstLine="0" w:firstLineChars="0"/>
+              <w:rPr>
+                <w:rFonts w:ascii="Helvetica" w:hAnsi="Helvetica" w:eastAsia="Helvetica" w:cs="Helvetica"/>
+                <w:i w:val="false"/>
+                <w:b w:val="false"/>
+                <w:u w:val="none"/>
+                <w:strike w:val="false"/>
+                <w:sz w:val="22"/>
+                <w:szCs w:val="22"/>
+                <w:color w:val="000000"/>
+              </w:rPr>
+            </w:pPr>
+            <w:r>
+              <w:rPr>
+                <w:rFonts w:ascii="Helvetica" w:hAnsi="Helvetica" w:eastAsia="Helvetica" w:cs="Helvetica"/>
+                <w:i w:val="false"/>
+                <w:b w:val="false"/>
+                <w:u w:val="none"/>
+                <w:strike w:val="false"/>
+                <w:sz w:val="22"/>
+                <w:szCs w:val="22"/>
+                <w:color w:val="000000"/>
+              </w:rPr>
+              <w:t xml:space="preserve"> 7 [4 - 10]</w:t>
+            </w:r>
+          </w:p>
+        </w:tc>
+        <w:tc>
+          <w:tcPr>
+            <w:tcBorders>
+              <w:bottom w:val="none" w:sz="0" w:space="0" w:color="000000"/>
+              <w:top w:val="none" w:sz="0" w:space="0" w:color="000000"/>
+              <w:left w:val="none" w:sz="0" w:space="0" w:color="000000"/>
+              <w:right w:val="none" w:sz="0" w:space="0" w:color="000000"/>
+            </w:tcBorders>
+            <w:shd w:val="clear" w:color="auto" w:fill="FFFFFF"/>
+            <w:tcMar>
+              <w:top w:w="0" w:type="dxa"/>
+              <w:bottom w:w="0" w:type="dxa"/>
+              <w:left w:w="0" w:type="dxa"/>
+              <w:right w:w="0" w:type="dxa"/>
+            </w:tcMar>
+            <w:vAlign w:val="center"/>
+          </w:tcPr>
+          <w:p>
+            <w:pPr>
+              <w:jc w:val="center"/>
+              <w:pBdr>
+                <w:bottom w:val="none" w:sz="0" w:space="0" w:color="000000"/>
+                <w:top w:val="none" w:sz="0" w:space="0" w:color="000000"/>
+                <w:left w:val="none" w:sz="0" w:space="0" w:color="000000"/>
+                <w:right w:val="none" w:sz="0" w:space="0" w:color="000000"/>
+              </w:pBdr>
+              <w:spacing w:after="100" w:before="100" w:line="240"/>
+              <w:ind w:left="100" w:right="100" w:firstLine="0" w:firstLineChars="0"/>
+              <w:rPr>
+                <w:rFonts w:ascii="Helvetica" w:hAnsi="Helvetica" w:eastAsia="Helvetica" w:cs="Helvetica"/>
+                <w:i w:val="false"/>
+                <w:b w:val="false"/>
+                <w:u w:val="none"/>
+                <w:strike w:val="false"/>
+                <w:sz w:val="22"/>
+                <w:szCs w:val="22"/>
+                <w:color w:val="000000"/>
+              </w:rPr>
+            </w:pPr>
+            <w:r>
+              <w:rPr>
+                <w:rFonts w:ascii="Helvetica" w:hAnsi="Helvetica" w:eastAsia="Helvetica" w:cs="Helvetica"/>
+                <w:i w:val="false"/>
+                <w:b w:val="false"/>
+                <w:u w:val="none"/>
+                <w:strike w:val="false"/>
+                <w:sz w:val="22"/>
+                <w:szCs w:val="22"/>
+                <w:color w:val="000000"/>
+              </w:rPr>
+              <w:t xml:space="preserve"> 5 [3 - 7]</w:t>
+            </w:r>
+          </w:p>
+        </w:tc>
+        <w:tc>
+          <w:tcPr>
+            <w:tcBorders>
+              <w:bottom w:val="none" w:sz="0" w:space="0" w:color="000000"/>
+              <w:top w:val="none" w:sz="0" w:space="0" w:color="000000"/>
+              <w:left w:val="none" w:sz="0" w:space="0" w:color="000000"/>
+              <w:right w:val="none" w:sz="0" w:space="0" w:color="000000"/>
+            </w:tcBorders>
+            <w:shd w:val="clear" w:color="auto" w:fill="FFFFFF"/>
+            <w:tcMar>
+              <w:top w:w="0" w:type="dxa"/>
+              <w:bottom w:w="0" w:type="dxa"/>
+              <w:left w:w="0" w:type="dxa"/>
+              <w:right w:w="0" w:type="dxa"/>
+            </w:tcMar>
+            <w:vAlign w:val="center"/>
+          </w:tcPr>
+          <w:p>
+            <w:pPr>
+              <w:jc w:val="center"/>
+              <w:pBdr>
+                <w:bottom w:val="none" w:sz="0" w:space="0" w:color="000000"/>
+                <w:top w:val="none" w:sz="0" w:space="0" w:color="000000"/>
+                <w:left w:val="none" w:sz="0" w:space="0" w:color="000000"/>
+                <w:right w:val="none" w:sz="0" w:space="0" w:color="000000"/>
+              </w:pBdr>
+              <w:spacing w:after="100" w:before="100" w:line="240"/>
+              <w:ind w:left="100" w:right="100" w:firstLine="0" w:firstLineChars="0"/>
+              <w:rPr>
+                <w:rFonts w:ascii="Helvetica" w:hAnsi="Helvetica" w:eastAsia="Helvetica" w:cs="Helvetica"/>
+                <w:i w:val="false"/>
+                <w:b w:val="false"/>
+                <w:u w:val="none"/>
+                <w:strike w:val="false"/>
+                <w:sz w:val="22"/>
+                <w:szCs w:val="22"/>
+                <w:color w:val="000000"/>
+              </w:rPr>
+            </w:pPr>
+            <w:r>
+              <w:rPr>
+                <w:rFonts w:ascii="Helvetica" w:hAnsi="Helvetica" w:eastAsia="Helvetica" w:cs="Helvetica"/>
+                <w:i w:val="false"/>
+                <w:b w:val="false"/>
+                <w:u w:val="none"/>
+                <w:strike w:val="false"/>
+                <w:sz w:val="22"/>
+                <w:szCs w:val="22"/>
+                <w:color w:val="000000"/>
+              </w:rPr>
+              <w:t xml:space="preserve">-1 [-5 - 2]</w:t>
+            </w:r>
+          </w:p>
+        </w:tc>
+      </w:tr>
+      <w:tr>
+        <w:trPr>
+          <w:trHeight w:val="620" w:hRule="auto"/>
+        </w:trPr>
+        body10
+        <w:tc>
+          <w:tcPr>
+            <w:tcBorders>
+              <w:bottom w:val="none" w:sz="0" w:space="0" w:color="000000"/>
+              <w:top w:val="none" w:sz="0" w:space="0" w:color="000000"/>
+              <w:left w:val="none" w:sz="0" w:space="0" w:color="000000"/>
+              <w:right w:val="none" w:sz="0" w:space="0" w:color="000000"/>
+            </w:tcBorders>
+            <w:shd w:val="clear" w:color="auto" w:fill="FFFFFF"/>
+            <w:tcMar>
+              <w:top w:w="0" w:type="dxa"/>
+              <w:bottom w:w="0" w:type="dxa"/>
+              <w:left w:w="0" w:type="dxa"/>
+              <w:right w:w="0" w:type="dxa"/>
+            </w:tcMar>
+            <w:vAlign w:val="center"/>
+          </w:tcPr>
+          <w:p>
+            <w:pPr>
+              <w:jc w:val="left"/>
+              <w:pBdr>
+                <w:bottom w:val="none" w:sz="0" w:space="0" w:color="000000"/>
+                <w:top w:val="none" w:sz="0" w:space="0" w:color="000000"/>
+                <w:left w:val="none" w:sz="0" w:space="0" w:color="000000"/>
+                <w:right w:val="none" w:sz="0" w:space="0" w:color="000000"/>
+              </w:pBdr>
+              <w:spacing w:after="100" w:before="100" w:line="240"/>
+              <w:ind w:left="100" w:right="100" w:firstLine="0" w:firstLineChars="0"/>
+              <w:rPr>
+                <w:rFonts w:ascii="Helvetica" w:hAnsi="Helvetica" w:eastAsia="Helvetica" w:cs="Helvetica"/>
+                <w:i w:val="false"/>
+                <w:b w:val="false"/>
+                <w:u w:val="none"/>
+                <w:strike w:val="false"/>
+                <w:sz w:val="22"/>
+                <w:szCs w:val="22"/>
+                <w:color w:val="000000"/>
+              </w:rPr>
+            </w:pPr>
+            <w:r>
+              <w:rPr>
+                <w:rFonts w:ascii="Helvetica" w:hAnsi="Helvetica" w:eastAsia="Helvetica" w:cs="Helvetica"/>
+                <w:i w:val="false"/>
+                <w:b w:val="false"/>
+                <w:u w:val="none"/>
+                <w:strike w:val="false"/>
+                <w:sz w:val="22"/>
+                <w:szCs w:val="22"/>
+                <w:color w:val="000000"/>
+              </w:rPr>
+              <w:t xml:space="preserve">ECMO Duration in weaned (days)</w:t>
+            </w:r>
+          </w:p>
+        </w:tc>
+        <w:tc>
+          <w:tcPr>
+            <w:tcBorders>
+              <w:bottom w:val="none" w:sz="0" w:space="0" w:color="000000"/>
+              <w:top w:val="none" w:sz="0" w:space="0" w:color="000000"/>
+              <w:left w:val="none" w:sz="0" w:space="0" w:color="000000"/>
+              <w:right w:val="none" w:sz="0" w:space="0" w:color="000000"/>
+            </w:tcBorders>
+            <w:shd w:val="clear" w:color="auto" w:fill="FFFFFF"/>
+            <w:tcMar>
+              <w:top w:w="0" w:type="dxa"/>
+              <w:bottom w:w="0" w:type="dxa"/>
+              <w:left w:w="0" w:type="dxa"/>
+              <w:right w:w="0" w:type="dxa"/>
+            </w:tcMar>
+            <w:vAlign w:val="center"/>
+          </w:tcPr>
+          <w:p>
+            <w:pPr>
+              <w:jc w:val="center"/>
+              <w:pBdr>
+                <w:bottom w:val="none" w:sz="0" w:space="0" w:color="000000"/>
+                <w:top w:val="none" w:sz="0" w:space="0" w:color="000000"/>
+                <w:left w:val="none" w:sz="0" w:space="0" w:color="000000"/>
+                <w:right w:val="none" w:sz="0" w:space="0" w:color="000000"/>
+              </w:pBdr>
+              <w:spacing w:after="100" w:before="100" w:line="240"/>
+              <w:ind w:left="100" w:right="100" w:firstLine="0" w:firstLineChars="0"/>
+              <w:rPr>
+                <w:rFonts w:ascii="Helvetica" w:hAnsi="Helvetica" w:eastAsia="Helvetica" w:cs="Helvetica"/>
+                <w:i w:val="false"/>
+                <w:b w:val="false"/>
+                <w:u w:val="none"/>
+                <w:strike w:val="false"/>
+                <w:sz w:val="22"/>
+                <w:szCs w:val="22"/>
+                <w:color w:val="000000"/>
+              </w:rPr>
+            </w:pPr>
+            <w:r>
+              <w:rPr>
+                <w:rFonts w:ascii="Helvetica" w:hAnsi="Helvetica" w:eastAsia="Helvetica" w:cs="Helvetica"/>
+                <w:i w:val="false"/>
+                <w:b w:val="false"/>
+                <w:u w:val="none"/>
+                <w:strike w:val="false"/>
+                <w:sz w:val="22"/>
+                <w:szCs w:val="22"/>
+                <w:color w:val="000000"/>
+              </w:rPr>
+              <w:t xml:space="preserve"> 4 [3 - 6]</w:t>
+            </w:r>
+          </w:p>
+        </w:tc>
+        <w:tc>
+          <w:tcPr>
+            <w:tcBorders>
+              <w:bottom w:val="none" w:sz="0" w:space="0" w:color="000000"/>
+              <w:top w:val="none" w:sz="0" w:space="0" w:color="000000"/>
+              <w:left w:val="none" w:sz="0" w:space="0" w:color="000000"/>
+              <w:right w:val="none" w:sz="0" w:space="0" w:color="000000"/>
+            </w:tcBorders>
+            <w:shd w:val="clear" w:color="auto" w:fill="FFFFFF"/>
+            <w:tcMar>
+              <w:top w:w="0" w:type="dxa"/>
+              <w:bottom w:w="0" w:type="dxa"/>
+              <w:left w:w="0" w:type="dxa"/>
+              <w:right w:w="0" w:type="dxa"/>
+            </w:tcMar>
+            <w:vAlign w:val="center"/>
+          </w:tcPr>
+          <w:p>
+            <w:pPr>
+              <w:jc w:val="center"/>
+              <w:pBdr>
+                <w:bottom w:val="none" w:sz="0" w:space="0" w:color="000000"/>
+                <w:top w:val="none" w:sz="0" w:space="0" w:color="000000"/>
+                <w:left w:val="none" w:sz="0" w:space="0" w:color="000000"/>
+                <w:right w:val="none" w:sz="0" w:space="0" w:color="000000"/>
+              </w:pBdr>
+              <w:spacing w:after="100" w:before="100" w:line="240"/>
+              <w:ind w:left="100" w:right="100" w:firstLine="0" w:firstLineChars="0"/>
+              <w:rPr>
+                <w:rFonts w:ascii="Helvetica" w:hAnsi="Helvetica" w:eastAsia="Helvetica" w:cs="Helvetica"/>
+                <w:i w:val="false"/>
+                <w:b w:val="false"/>
+                <w:u w:val="none"/>
+                <w:strike w:val="false"/>
+                <w:sz w:val="22"/>
+                <w:szCs w:val="22"/>
+                <w:color w:val="000000"/>
+              </w:rPr>
+            </w:pPr>
+            <w:r>
+              <w:rPr>
+                <w:rFonts w:ascii="Helvetica" w:hAnsi="Helvetica" w:eastAsia="Helvetica" w:cs="Helvetica"/>
+                <w:i w:val="false"/>
+                <w:b w:val="false"/>
+                <w:u w:val="none"/>
+                <w:strike w:val="false"/>
+                <w:sz w:val="22"/>
+                <w:szCs w:val="22"/>
+                <w:color w:val="000000"/>
+              </w:rPr>
+              <w:t xml:space="preserve"> 7 [4 - 10]</w:t>
+            </w:r>
+          </w:p>
+        </w:tc>
+        <w:tc>
+          <w:tcPr>
+            <w:tcBorders>
+              <w:bottom w:val="none" w:sz="0" w:space="0" w:color="000000"/>
+              <w:top w:val="none" w:sz="0" w:space="0" w:color="000000"/>
+              <w:left w:val="none" w:sz="0" w:space="0" w:color="000000"/>
+              <w:right w:val="none" w:sz="0" w:space="0" w:color="000000"/>
+            </w:tcBorders>
+            <w:shd w:val="clear" w:color="auto" w:fill="FFFFFF"/>
+            <w:tcMar>
+              <w:top w:w="0" w:type="dxa"/>
+              <w:bottom w:w="0" w:type="dxa"/>
+              <w:left w:w="0" w:type="dxa"/>
+              <w:right w:w="0" w:type="dxa"/>
+            </w:tcMar>
+            <w:vAlign w:val="center"/>
+          </w:tcPr>
+          <w:p>
+            <w:pPr>
+              <w:jc w:val="center"/>
+              <w:pBdr>
+                <w:bottom w:val="none" w:sz="0" w:space="0" w:color="000000"/>
+                <w:top w:val="none" w:sz="0" w:space="0" w:color="000000"/>
+                <w:left w:val="none" w:sz="0" w:space="0" w:color="000000"/>
+                <w:right w:val="none" w:sz="0" w:space="0" w:color="000000"/>
+              </w:pBdr>
+              <w:spacing w:after="100" w:before="100" w:line="240"/>
+              <w:ind w:left="100" w:right="100" w:firstLine="0" w:firstLineChars="0"/>
+              <w:rPr>
+                <w:rFonts w:ascii="Helvetica" w:hAnsi="Helvetica" w:eastAsia="Helvetica" w:cs="Helvetica"/>
+                <w:i w:val="false"/>
+                <w:b w:val="false"/>
+                <w:u w:val="none"/>
+                <w:strike w:val="false"/>
+                <w:sz w:val="22"/>
+                <w:szCs w:val="22"/>
+                <w:color w:val="000000"/>
+              </w:rPr>
+            </w:pPr>
+            <w:r>
+              <w:rPr>
+                <w:rFonts w:ascii="Helvetica" w:hAnsi="Helvetica" w:eastAsia="Helvetica" w:cs="Helvetica"/>
+                <w:i w:val="false"/>
+                <w:b w:val="false"/>
+                <w:u w:val="none"/>
+                <w:strike w:val="false"/>
+                <w:sz w:val="22"/>
+                <w:szCs w:val="22"/>
+                <w:color w:val="000000"/>
+              </w:rPr>
+              <w:t xml:space="preserve">2 [-1 - 6]</w:t>
             </w:r>
           </w:p>
         </w:tc>
@@ -2043,7 +2487,7 @@
         <w:trPr>
           <w:trHeight w:val="621" w:hRule="auto"/>
         </w:trPr>
-        body 9
+        body11
         <w:tc>
           <w:tcPr>
             <w:tcBorders>
@@ -2094,6 +2538,228 @@
                 <w:szCs w:val="22"/>
                 <w:color w:val="000000"/>
               </w:rPr>
+              <w:t xml:space="preserve">ECMO Weaning (%)</w:t>
+            </w:r>
+          </w:p>
+        </w:tc>
+        <w:tc>
+          <w:tcPr>
+            <w:tcBorders>
+              <w:bottom w:val="none" w:sz="0" w:space="0" w:color="000000"/>
+              <w:top w:val="none" w:sz="0" w:space="0" w:color="000000"/>
+              <w:left w:val="none" w:sz="0" w:space="0" w:color="000000"/>
+              <w:right w:val="none" w:sz="0" w:space="0" w:color="000000"/>
+            </w:tcBorders>
+            <w:shd w:val="clear" w:color="auto" w:fill="FFFFFF"/>
+            <w:tcMar>
+              <w:top w:w="0" w:type="dxa"/>
+              <w:bottom w:w="0" w:type="dxa"/>
+              <w:left w:w="0" w:type="dxa"/>
+              <w:right w:w="0" w:type="dxa"/>
+            </w:tcMar>
+            <w:vAlign w:val="center"/>
+          </w:tcPr>
+          <w:p>
+            <w:pPr>
+              <w:jc w:val="center"/>
+              <w:pBdr>
+                <w:bottom w:val="none" w:sz="0" w:space="0" w:color="000000"/>
+                <w:top w:val="none" w:sz="0" w:space="0" w:color="000000"/>
+                <w:left w:val="none" w:sz="0" w:space="0" w:color="000000"/>
+                <w:right w:val="none" w:sz="0" w:space="0" w:color="000000"/>
+              </w:pBdr>
+              <w:spacing w:after="100" w:before="100" w:line="240"/>
+              <w:ind w:left="100" w:right="100" w:firstLine="0" w:firstLineChars="0"/>
+              <w:rPr>
+                <w:rFonts w:ascii="Helvetica" w:hAnsi="Helvetica" w:eastAsia="Helvetica" w:cs="Helvetica"/>
+                <w:i w:val="false"/>
+                <w:b w:val="false"/>
+                <w:u w:val="none"/>
+                <w:strike w:val="false"/>
+                <w:sz w:val="22"/>
+                <w:szCs w:val="22"/>
+                <w:color w:val="000000"/>
+              </w:rPr>
+            </w:pPr>
+            <w:r>
+              <w:rPr>
+                <w:rFonts w:ascii="Helvetica" w:hAnsi="Helvetica" w:eastAsia="Helvetica" w:cs="Helvetica"/>
+                <w:i w:val="false"/>
+                <w:b w:val="false"/>
+                <w:u w:val="none"/>
+                <w:strike w:val="false"/>
+                <w:sz w:val="22"/>
+                <w:szCs w:val="22"/>
+                <w:color w:val="000000"/>
+              </w:rPr>
+              <w:t xml:space="preserve">  14 (58) </w:t>
+            </w:r>
+          </w:p>
+        </w:tc>
+        <w:tc>
+          <w:tcPr>
+            <w:tcBorders>
+              <w:bottom w:val="none" w:sz="0" w:space="0" w:color="000000"/>
+              <w:top w:val="none" w:sz="0" w:space="0" w:color="000000"/>
+              <w:left w:val="none" w:sz="0" w:space="0" w:color="000000"/>
+              <w:right w:val="none" w:sz="0" w:space="0" w:color="000000"/>
+            </w:tcBorders>
+            <w:shd w:val="clear" w:color="auto" w:fill="FFFFFF"/>
+            <w:tcMar>
+              <w:top w:w="0" w:type="dxa"/>
+              <w:bottom w:w="0" w:type="dxa"/>
+              <w:left w:w="0" w:type="dxa"/>
+              <w:right w:w="0" w:type="dxa"/>
+            </w:tcMar>
+            <w:vAlign w:val="center"/>
+          </w:tcPr>
+          <w:p>
+            <w:pPr>
+              <w:jc w:val="center"/>
+              <w:pBdr>
+                <w:bottom w:val="none" w:sz="0" w:space="0" w:color="000000"/>
+                <w:top w:val="none" w:sz="0" w:space="0" w:color="000000"/>
+                <w:left w:val="none" w:sz="0" w:space="0" w:color="000000"/>
+                <w:right w:val="none" w:sz="0" w:space="0" w:color="000000"/>
+              </w:pBdr>
+              <w:spacing w:after="100" w:before="100" w:line="240"/>
+              <w:ind w:left="100" w:right="100" w:firstLine="0" w:firstLineChars="0"/>
+              <w:rPr>
+                <w:rFonts w:ascii="Helvetica" w:hAnsi="Helvetica" w:eastAsia="Helvetica" w:cs="Helvetica"/>
+                <w:i w:val="false"/>
+                <w:b w:val="false"/>
+                <w:u w:val="none"/>
+                <w:strike w:val="false"/>
+                <w:sz w:val="22"/>
+                <w:szCs w:val="22"/>
+                <w:color w:val="000000"/>
+              </w:rPr>
+            </w:pPr>
+            <w:r>
+              <w:rPr>
+                <w:rFonts w:ascii="Helvetica" w:hAnsi="Helvetica" w:eastAsia="Helvetica" w:cs="Helvetica"/>
+                <w:i w:val="false"/>
+                <w:b w:val="false"/>
+                <w:u w:val="none"/>
+                <w:strike w:val="false"/>
+                <w:sz w:val="22"/>
+                <w:szCs w:val="22"/>
+                <w:color w:val="000000"/>
+              </w:rPr>
+              <w:t xml:space="preserve">   7 (30) </w:t>
+            </w:r>
+          </w:p>
+        </w:tc>
+        <w:tc>
+          <w:tcPr>
+            <w:tcBorders>
+              <w:bottom w:val="none" w:sz="0" w:space="0" w:color="000000"/>
+              <w:top w:val="none" w:sz="0" w:space="0" w:color="000000"/>
+              <w:left w:val="none" w:sz="0" w:space="0" w:color="000000"/>
+              <w:right w:val="none" w:sz="0" w:space="0" w:color="000000"/>
+            </w:tcBorders>
+            <w:shd w:val="clear" w:color="auto" w:fill="FFFFFF"/>
+            <w:tcMar>
+              <w:top w:w="0" w:type="dxa"/>
+              <w:bottom w:w="0" w:type="dxa"/>
+              <w:left w:w="0" w:type="dxa"/>
+              <w:right w:w="0" w:type="dxa"/>
+            </w:tcMar>
+            <w:vAlign w:val="center"/>
+          </w:tcPr>
+          <w:p>
+            <w:pPr>
+              <w:jc w:val="center"/>
+              <w:pBdr>
+                <w:bottom w:val="none" w:sz="0" w:space="0" w:color="000000"/>
+                <w:top w:val="none" w:sz="0" w:space="0" w:color="000000"/>
+                <w:left w:val="none" w:sz="0" w:space="0" w:color="000000"/>
+                <w:right w:val="none" w:sz="0" w:space="0" w:color="000000"/>
+              </w:pBdr>
+              <w:spacing w:after="100" w:before="100" w:line="240"/>
+              <w:ind w:left="100" w:right="100" w:firstLine="0" w:firstLineChars="0"/>
+              <w:rPr>
+                <w:rFonts w:ascii="Helvetica" w:hAnsi="Helvetica" w:eastAsia="Helvetica" w:cs="Helvetica"/>
+                <w:i w:val="false"/>
+                <w:b w:val="false"/>
+                <w:u w:val="none"/>
+                <w:strike w:val="false"/>
+                <w:sz w:val="22"/>
+                <w:szCs w:val="22"/>
+                <w:color w:val="000000"/>
+              </w:rPr>
+            </w:pPr>
+            <w:r>
+              <w:rPr>
+                <w:rFonts w:ascii="Helvetica" w:hAnsi="Helvetica" w:eastAsia="Helvetica" w:cs="Helvetica"/>
+                <w:i w:val="false"/>
+                <w:b w:val="false"/>
+                <w:u w:val="none"/>
+                <w:strike w:val="false"/>
+                <w:sz w:val="22"/>
+                <w:szCs w:val="22"/>
+                <w:color w:val="000000"/>
+              </w:rPr>
+              <w:t xml:space="preserve">-28 [-52 - +1]</w:t>
+            </w:r>
+          </w:p>
+        </w:tc>
+      </w:tr>
+      <w:tr>
+        <w:trPr>
+          <w:trHeight w:val="621" w:hRule="auto"/>
+        </w:trPr>
+        body12
+        <w:tc>
+          <w:tcPr>
+            <w:tcBorders>
+              <w:bottom w:val="none" w:sz="0" w:space="0" w:color="000000"/>
+              <w:top w:val="none" w:sz="0" w:space="0" w:color="000000"/>
+              <w:left w:val="none" w:sz="0" w:space="0" w:color="000000"/>
+              <w:right w:val="none" w:sz="0" w:space="0" w:color="000000"/>
+            </w:tcBorders>
+            <w:shd w:val="clear" w:color="auto" w:fill="FFFFFF"/>
+            <w:tcMar>
+              <w:top w:w="0" w:type="dxa"/>
+              <w:bottom w:w="0" w:type="dxa"/>
+              <w:left w:w="0" w:type="dxa"/>
+              <w:right w:w="0" w:type="dxa"/>
+            </w:tcMar>
+            <w:vAlign w:val="center"/>
+          </w:tcPr>
+          <w:p>
+            <w:pPr>
+              <w:jc w:val="left"/>
+              <w:pBdr>
+                <w:bottom w:val="none" w:sz="0" w:space="0" w:color="000000"/>
+                <w:top w:val="none" w:sz="0" w:space="0" w:color="000000"/>
+                <w:left w:val="none" w:sz="0" w:space="0" w:color="000000"/>
+                <w:right w:val="none" w:sz="0" w:space="0" w:color="000000"/>
+              </w:pBdr>
+              <w:spacing w:after="100" w:before="100" w:line="240"/>
+              <w:ind w:left="100" w:right="100" w:firstLine="0" w:firstLineChars="0"/>
+              <w:rPr>
+                <w:rFonts w:ascii="Helvetica" w:hAnsi="Helvetica" w:eastAsia="Helvetica" w:cs="Helvetica"/>
+                <w:i w:val="false"/>
+                <w:b w:val="false"/>
+                <w:u w:val="none"/>
+                <w:strike w:val="false"/>
+                <w:sz w:val="22"/>
+                <w:szCs w:val="22"/>
+                <w:color w:val="000000"/>
+              </w:rPr>
+            </w:pPr>
+            <w:r>
+              <w:rPr>
+                <w:rFonts w:ascii="Helvetica" w:hAnsi="Helvetica" w:eastAsia="Helvetica" w:cs="Helvetica"/>
+                <w:i w:val="false"/>
+                <w:b w:val="false"/>
+                <w:u w:val="none"/>
+                <w:strike w:val="false"/>
+                <w:sz w:val="22"/>
+                <w:szCs w:val="22"/>
+                <w:color w:val="000000"/>
+              </w:rPr>
               <w:t xml:space="preserve">ICU Length of Stay (days)</w:t>
             </w:r>
           </w:p>
@@ -2148,7 +2814,7 @@
                 <w:szCs w:val="22"/>
                 <w:color w:val="000000"/>
               </w:rPr>
-              <w:t xml:space="preserve">13.5 [6.8, 16.8]</w:t>
+              <w:t xml:space="preserve">14 [7 - 17]</w:t>
             </w:r>
           </w:p>
         </w:tc>
@@ -2202,7 +2868,7 @@
                 <w:szCs w:val="22"/>
                 <w:color w:val="000000"/>
               </w:rPr>
-              <w:t xml:space="preserve">15.0 [5.0, 34.0]</w:t>
+              <w:t xml:space="preserve">15 [5 - 34]</w:t>
             </w:r>
           </w:p>
         </w:tc>
@@ -2256,7 +2922,229 @@
                 <w:szCs w:val="22"/>
                 <w:color w:val="000000"/>
               </w:rPr>
-              <w:t xml:space="preserve">2.0 [-4.0; 12.0]</w:t>
+              <w:t xml:space="preserve">2 [-4 - 12]</w:t>
+            </w:r>
+          </w:p>
+        </w:tc>
+      </w:tr>
+      <w:tr>
+        <w:trPr>
+          <w:trHeight w:val="617" w:hRule="auto"/>
+        </w:trPr>
+        body13
+        <w:tc>
+          <w:tcPr>
+            <w:tcBorders>
+              <w:bottom w:val="none" w:sz="0" w:space="0" w:color="000000"/>
+              <w:top w:val="none" w:sz="0" w:space="0" w:color="000000"/>
+              <w:left w:val="none" w:sz="0" w:space="0" w:color="000000"/>
+              <w:right w:val="none" w:sz="0" w:space="0" w:color="000000"/>
+            </w:tcBorders>
+            <w:shd w:val="clear" w:color="auto" w:fill="FFFFFF"/>
+            <w:tcMar>
+              <w:top w:w="0" w:type="dxa"/>
+              <w:bottom w:w="0" w:type="dxa"/>
+              <w:left w:w="0" w:type="dxa"/>
+              <w:right w:w="0" w:type="dxa"/>
+            </w:tcMar>
+            <w:vAlign w:val="center"/>
+          </w:tcPr>
+          <w:p>
+            <w:pPr>
+              <w:jc w:val="left"/>
+              <w:pBdr>
+                <w:bottom w:val="none" w:sz="0" w:space="0" w:color="000000"/>
+                <w:top w:val="none" w:sz="0" w:space="0" w:color="000000"/>
+                <w:left w:val="none" w:sz="0" w:space="0" w:color="000000"/>
+                <w:right w:val="none" w:sz="0" w:space="0" w:color="000000"/>
+              </w:pBdr>
+              <w:spacing w:after="100" w:before="100" w:line="240"/>
+              <w:ind w:left="100" w:right="100" w:firstLine="0" w:firstLineChars="0"/>
+              <w:rPr>
+                <w:rFonts w:ascii="Helvetica" w:hAnsi="Helvetica" w:eastAsia="Helvetica" w:cs="Helvetica"/>
+                <w:i w:val="false"/>
+                <w:b w:val="false"/>
+                <w:u w:val="none"/>
+                <w:strike w:val="false"/>
+                <w:sz w:val="22"/>
+                <w:szCs w:val="22"/>
+                <w:color w:val="000000"/>
+              </w:rPr>
+            </w:pPr>
+            <w:r>
+              <w:rPr>
+                <w:rFonts w:ascii="Helvetica" w:hAnsi="Helvetica" w:eastAsia="Helvetica" w:cs="Helvetica"/>
+                <w:i w:val="false"/>
+                <w:b w:val="false"/>
+                <w:u w:val="none"/>
+                <w:strike w:val="false"/>
+                <w:sz w:val="22"/>
+                <w:szCs w:val="22"/>
+                <w:color w:val="000000"/>
+              </w:rPr>
+              <w:t xml:space="preserve">Intra-Aortic Balloon Pump (%)</w:t>
+            </w:r>
+          </w:p>
+        </w:tc>
+        <w:tc>
+          <w:tcPr>
+            <w:tcBorders>
+              <w:bottom w:val="none" w:sz="0" w:space="0" w:color="000000"/>
+              <w:top w:val="none" w:sz="0" w:space="0" w:color="000000"/>
+              <w:left w:val="none" w:sz="0" w:space="0" w:color="000000"/>
+              <w:right w:val="none" w:sz="0" w:space="0" w:color="000000"/>
+            </w:tcBorders>
+            <w:shd w:val="clear" w:color="auto" w:fill="FFFFFF"/>
+            <w:tcMar>
+              <w:top w:w="0" w:type="dxa"/>
+              <w:bottom w:w="0" w:type="dxa"/>
+              <w:left w:w="0" w:type="dxa"/>
+              <w:right w:w="0" w:type="dxa"/>
+            </w:tcMar>
+            <w:vAlign w:val="center"/>
+          </w:tcPr>
+          <w:p>
+            <w:pPr>
+              <w:jc w:val="center"/>
+              <w:pBdr>
+                <w:bottom w:val="none" w:sz="0" w:space="0" w:color="000000"/>
+                <w:top w:val="none" w:sz="0" w:space="0" w:color="000000"/>
+                <w:left w:val="none" w:sz="0" w:space="0" w:color="000000"/>
+                <w:right w:val="none" w:sz="0" w:space="0" w:color="000000"/>
+              </w:pBdr>
+              <w:spacing w:after="100" w:before="100" w:line="240"/>
+              <w:ind w:left="100" w:right="100" w:firstLine="0" w:firstLineChars="0"/>
+              <w:rPr>
+                <w:rFonts w:ascii="Helvetica" w:hAnsi="Helvetica" w:eastAsia="Helvetica" w:cs="Helvetica"/>
+                <w:i w:val="false"/>
+                <w:b w:val="false"/>
+                <w:u w:val="none"/>
+                <w:strike w:val="false"/>
+                <w:sz w:val="22"/>
+                <w:szCs w:val="22"/>
+                <w:color w:val="000000"/>
+              </w:rPr>
+            </w:pPr>
+            <w:r>
+              <w:rPr>
+                <w:rFonts w:ascii="Helvetica" w:hAnsi="Helvetica" w:eastAsia="Helvetica" w:cs="Helvetica"/>
+                <w:i w:val="false"/>
+                <w:b w:val="false"/>
+                <w:u w:val="none"/>
+                <w:strike w:val="false"/>
+                <w:sz w:val="22"/>
+                <w:szCs w:val="22"/>
+                <w:color w:val="000000"/>
+              </w:rPr>
+              <w:t xml:space="preserve">   6 (60) </w:t>
+            </w:r>
+          </w:p>
+        </w:tc>
+        <w:tc>
+          <w:tcPr>
+            <w:tcBorders>
+              <w:bottom w:val="none" w:sz="0" w:space="0" w:color="000000"/>
+              <w:top w:val="none" w:sz="0" w:space="0" w:color="000000"/>
+              <w:left w:val="none" w:sz="0" w:space="0" w:color="000000"/>
+              <w:right w:val="none" w:sz="0" w:space="0" w:color="000000"/>
+            </w:tcBorders>
+            <w:shd w:val="clear" w:color="auto" w:fill="FFFFFF"/>
+            <w:tcMar>
+              <w:top w:w="0" w:type="dxa"/>
+              <w:bottom w:w="0" w:type="dxa"/>
+              <w:left w:w="0" w:type="dxa"/>
+              <w:right w:w="0" w:type="dxa"/>
+            </w:tcMar>
+            <w:vAlign w:val="center"/>
+          </w:tcPr>
+          <w:p>
+            <w:pPr>
+              <w:jc w:val="center"/>
+              <w:pBdr>
+                <w:bottom w:val="none" w:sz="0" w:space="0" w:color="000000"/>
+                <w:top w:val="none" w:sz="0" w:space="0" w:color="000000"/>
+                <w:left w:val="none" w:sz="0" w:space="0" w:color="000000"/>
+                <w:right w:val="none" w:sz="0" w:space="0" w:color="000000"/>
+              </w:pBdr>
+              <w:spacing w:after="100" w:before="100" w:line="240"/>
+              <w:ind w:left="100" w:right="100" w:firstLine="0" w:firstLineChars="0"/>
+              <w:rPr>
+                <w:rFonts w:ascii="Helvetica" w:hAnsi="Helvetica" w:eastAsia="Helvetica" w:cs="Helvetica"/>
+                <w:i w:val="false"/>
+                <w:b w:val="false"/>
+                <w:u w:val="none"/>
+                <w:strike w:val="false"/>
+                <w:sz w:val="22"/>
+                <w:szCs w:val="22"/>
+                <w:color w:val="000000"/>
+              </w:rPr>
+            </w:pPr>
+            <w:r>
+              <w:rPr>
+                <w:rFonts w:ascii="Helvetica" w:hAnsi="Helvetica" w:eastAsia="Helvetica" w:cs="Helvetica"/>
+                <w:i w:val="false"/>
+                <w:b w:val="false"/>
+                <w:u w:val="none"/>
+                <w:strike w:val="false"/>
+                <w:sz w:val="22"/>
+                <w:szCs w:val="22"/>
+                <w:color w:val="000000"/>
+              </w:rPr>
+              <w:t xml:space="preserve">   5 (46) </w:t>
+            </w:r>
+          </w:p>
+        </w:tc>
+        <w:tc>
+          <w:tcPr>
+            <w:tcBorders>
+              <w:bottom w:val="none" w:sz="0" w:space="0" w:color="000000"/>
+              <w:top w:val="none" w:sz="0" w:space="0" w:color="000000"/>
+              <w:left w:val="none" w:sz="0" w:space="0" w:color="000000"/>
+              <w:right w:val="none" w:sz="0" w:space="0" w:color="000000"/>
+            </w:tcBorders>
+            <w:shd w:val="clear" w:color="auto" w:fill="FFFFFF"/>
+            <w:tcMar>
+              <w:top w:w="0" w:type="dxa"/>
+              <w:bottom w:w="0" w:type="dxa"/>
+              <w:left w:w="0" w:type="dxa"/>
+              <w:right w:w="0" w:type="dxa"/>
+            </w:tcMar>
+            <w:vAlign w:val="center"/>
+          </w:tcPr>
+          <w:p>
+            <w:pPr>
+              <w:jc w:val="center"/>
+              <w:pBdr>
+                <w:bottom w:val="none" w:sz="0" w:space="0" w:color="000000"/>
+                <w:top w:val="none" w:sz="0" w:space="0" w:color="000000"/>
+                <w:left w:val="none" w:sz="0" w:space="0" w:color="000000"/>
+                <w:right w:val="none" w:sz="0" w:space="0" w:color="000000"/>
+              </w:pBdr>
+              <w:spacing w:after="100" w:before="100" w:line="240"/>
+              <w:ind w:left="100" w:right="100" w:firstLine="0" w:firstLineChars="0"/>
+              <w:rPr>
+                <w:rFonts w:ascii="Helvetica" w:hAnsi="Helvetica" w:eastAsia="Helvetica" w:cs="Helvetica"/>
+                <w:i w:val="false"/>
+                <w:b w:val="false"/>
+                <w:u w:val="none"/>
+                <w:strike w:val="false"/>
+                <w:sz w:val="22"/>
+                <w:szCs w:val="22"/>
+                <w:color w:val="000000"/>
+              </w:rPr>
+            </w:pPr>
+            <w:r>
+              <w:rPr>
+                <w:rFonts w:ascii="Helvetica" w:hAnsi="Helvetica" w:eastAsia="Helvetica" w:cs="Helvetica"/>
+                <w:i w:val="false"/>
+                <w:b w:val="false"/>
+                <w:u w:val="none"/>
+                <w:strike w:val="false"/>
+                <w:sz w:val="22"/>
+                <w:szCs w:val="22"/>
+                <w:color w:val="000000"/>
+              </w:rPr>
+              <w:t xml:space="preserve">-14 [-51 - +27]</w:t>
             </w:r>
           </w:p>
         </w:tc>
@@ -2265,7 +3153,7 @@
         <w:trPr>
           <w:trHeight w:val="577" w:hRule="auto"/>
         </w:trPr>
-        body10
+        body14
         <w:tc>
           <w:tcPr>
             <w:tcBorders>
@@ -2479,894 +3367,6 @@
                 <w:color w:val="000000"/>
               </w:rPr>
               <w:t xml:space="preserve"/>
-            </w:r>
-          </w:p>
-        </w:tc>
-      </w:tr>
-      <w:tr>
-        <w:trPr>
-          <w:trHeight w:val="618" w:hRule="auto"/>
-        </w:trPr>
-        body11
-        <w:tc>
-          <w:tcPr>
-            <w:tcBorders>
-              <w:bottom w:val="none" w:sz="0" w:space="0" w:color="000000"/>
-              <w:top w:val="none" w:sz="0" w:space="0" w:color="000000"/>
-              <w:left w:val="none" w:sz="0" w:space="0" w:color="000000"/>
-              <w:right w:val="none" w:sz="0" w:space="0" w:color="000000"/>
-            </w:tcBorders>
-            <w:shd w:val="clear" w:color="auto" w:fill="FFFFFF"/>
-            <w:tcMar>
-              <w:top w:w="0" w:type="dxa"/>
-              <w:bottom w:w="0" w:type="dxa"/>
-              <w:left w:w="0" w:type="dxa"/>
-              <w:right w:w="0" w:type="dxa"/>
-            </w:tcMar>
-            <w:vAlign w:val="center"/>
-          </w:tcPr>
-          <w:p>
-            <w:pPr>
-              <w:jc w:val="left"/>
-              <w:pBdr>
-                <w:bottom w:val="none" w:sz="0" w:space="0" w:color="000000"/>
-                <w:top w:val="none" w:sz="0" w:space="0" w:color="000000"/>
-                <w:left w:val="none" w:sz="0" w:space="0" w:color="000000"/>
-                <w:right w:val="none" w:sz="0" w:space="0" w:color="000000"/>
-              </w:pBdr>
-              <w:spacing w:after="100" w:before="100" w:line="240"/>
-              <w:ind w:left="100" w:right="100" w:firstLine="0" w:firstLineChars="0"/>
-              <w:rPr>
-                <w:rFonts w:ascii="Helvetica" w:hAnsi="Helvetica" w:eastAsia="Helvetica" w:cs="Helvetica"/>
-                <w:i w:val="false"/>
-                <w:b w:val="false"/>
-                <w:u w:val="none"/>
-                <w:strike w:val="false"/>
-                <w:sz w:val="22"/>
-                <w:szCs w:val="22"/>
-                <w:color w:val="000000"/>
-              </w:rPr>
-            </w:pPr>
-            <w:r>
-              <w:rPr>
-                <w:rFonts w:ascii="Helvetica" w:hAnsi="Helvetica" w:eastAsia="Helvetica" w:cs="Helvetica"/>
-                <w:i w:val="false"/>
-                <w:b w:val="false"/>
-                <w:u w:val="none"/>
-                <w:strike w:val="false"/>
-                <w:sz w:val="22"/>
-                <w:szCs w:val="22"/>
-                <w:color w:val="000000"/>
-              </w:rPr>
-              <w:t xml:space="preserve">Death in ICU (%)</w:t>
-            </w:r>
-          </w:p>
-        </w:tc>
-        <w:tc>
-          <w:tcPr>
-            <w:tcBorders>
-              <w:bottom w:val="none" w:sz="0" w:space="0" w:color="000000"/>
-              <w:top w:val="none" w:sz="0" w:space="0" w:color="000000"/>
-              <w:left w:val="none" w:sz="0" w:space="0" w:color="000000"/>
-              <w:right w:val="none" w:sz="0" w:space="0" w:color="000000"/>
-            </w:tcBorders>
-            <w:shd w:val="clear" w:color="auto" w:fill="FFFFFF"/>
-            <w:tcMar>
-              <w:top w:w="0" w:type="dxa"/>
-              <w:bottom w:w="0" w:type="dxa"/>
-              <w:left w:w="0" w:type="dxa"/>
-              <w:right w:w="0" w:type="dxa"/>
-            </w:tcMar>
-            <w:vAlign w:val="center"/>
-          </w:tcPr>
-          <w:p>
-            <w:pPr>
-              <w:jc w:val="center"/>
-              <w:pBdr>
-                <w:bottom w:val="none" w:sz="0" w:space="0" w:color="000000"/>
-                <w:top w:val="none" w:sz="0" w:space="0" w:color="000000"/>
-                <w:left w:val="none" w:sz="0" w:space="0" w:color="000000"/>
-                <w:right w:val="none" w:sz="0" w:space="0" w:color="000000"/>
-              </w:pBdr>
-              <w:spacing w:after="100" w:before="100" w:line="240"/>
-              <w:ind w:left="100" w:right="100" w:firstLine="0" w:firstLineChars="0"/>
-              <w:rPr>
-                <w:rFonts w:ascii="Helvetica" w:hAnsi="Helvetica" w:eastAsia="Helvetica" w:cs="Helvetica"/>
-                <w:i w:val="false"/>
-                <w:b w:val="false"/>
-                <w:u w:val="none"/>
-                <w:strike w:val="false"/>
-                <w:sz w:val="22"/>
-                <w:szCs w:val="22"/>
-                <w:color w:val="000000"/>
-              </w:rPr>
-            </w:pPr>
-            <w:r>
-              <w:rPr>
-                <w:rFonts w:ascii="Helvetica" w:hAnsi="Helvetica" w:eastAsia="Helvetica" w:cs="Helvetica"/>
-                <w:i w:val="false"/>
-                <w:b w:val="false"/>
-                <w:u w:val="none"/>
-                <w:strike w:val="false"/>
-                <w:sz w:val="22"/>
-                <w:szCs w:val="22"/>
-                <w:color w:val="000000"/>
-              </w:rPr>
-              <w:t xml:space="preserve">   7 (29.2) </w:t>
-            </w:r>
-          </w:p>
-        </w:tc>
-        <w:tc>
-          <w:tcPr>
-            <w:tcBorders>
-              <w:bottom w:val="none" w:sz="0" w:space="0" w:color="000000"/>
-              <w:top w:val="none" w:sz="0" w:space="0" w:color="000000"/>
-              <w:left w:val="none" w:sz="0" w:space="0" w:color="000000"/>
-              <w:right w:val="none" w:sz="0" w:space="0" w:color="000000"/>
-            </w:tcBorders>
-            <w:shd w:val="clear" w:color="auto" w:fill="FFFFFF"/>
-            <w:tcMar>
-              <w:top w:w="0" w:type="dxa"/>
-              <w:bottom w:w="0" w:type="dxa"/>
-              <w:left w:w="0" w:type="dxa"/>
-              <w:right w:w="0" w:type="dxa"/>
-            </w:tcMar>
-            <w:vAlign w:val="center"/>
-          </w:tcPr>
-          <w:p>
-            <w:pPr>
-              <w:jc w:val="center"/>
-              <w:pBdr>
-                <w:bottom w:val="none" w:sz="0" w:space="0" w:color="000000"/>
-                <w:top w:val="none" w:sz="0" w:space="0" w:color="000000"/>
-                <w:left w:val="none" w:sz="0" w:space="0" w:color="000000"/>
-                <w:right w:val="none" w:sz="0" w:space="0" w:color="000000"/>
-              </w:pBdr>
-              <w:spacing w:after="100" w:before="100" w:line="240"/>
-              <w:ind w:left="100" w:right="100" w:firstLine="0" w:firstLineChars="0"/>
-              <w:rPr>
-                <w:rFonts w:ascii="Helvetica" w:hAnsi="Helvetica" w:eastAsia="Helvetica" w:cs="Helvetica"/>
-                <w:i w:val="false"/>
-                <w:b w:val="false"/>
-                <w:u w:val="none"/>
-                <w:strike w:val="false"/>
-                <w:sz w:val="22"/>
-                <w:szCs w:val="22"/>
-                <w:color w:val="000000"/>
-              </w:rPr>
-            </w:pPr>
-            <w:r>
-              <w:rPr>
-                <w:rFonts w:ascii="Helvetica" w:hAnsi="Helvetica" w:eastAsia="Helvetica" w:cs="Helvetica"/>
-                <w:i w:val="false"/>
-                <w:b w:val="false"/>
-                <w:u w:val="none"/>
-                <w:strike w:val="false"/>
-                <w:sz w:val="22"/>
-                <w:szCs w:val="22"/>
-                <w:color w:val="000000"/>
-              </w:rPr>
-              <w:t xml:space="preserve">  13 (56.5) </w:t>
-            </w:r>
-          </w:p>
-        </w:tc>
-        <w:tc>
-          <w:tcPr>
-            <w:tcBorders>
-              <w:bottom w:val="none" w:sz="0" w:space="0" w:color="000000"/>
-              <w:top w:val="none" w:sz="0" w:space="0" w:color="000000"/>
-              <w:left w:val="none" w:sz="0" w:space="0" w:color="000000"/>
-              <w:right w:val="none" w:sz="0" w:space="0" w:color="000000"/>
-            </w:tcBorders>
-            <w:shd w:val="clear" w:color="auto" w:fill="FFFFFF"/>
-            <w:tcMar>
-              <w:top w:w="0" w:type="dxa"/>
-              <w:bottom w:w="0" w:type="dxa"/>
-              <w:left w:w="0" w:type="dxa"/>
-              <w:right w:w="0" w:type="dxa"/>
-            </w:tcMar>
-            <w:vAlign w:val="center"/>
-          </w:tcPr>
-          <w:p>
-            <w:pPr>
-              <w:jc w:val="center"/>
-              <w:pBdr>
-                <w:bottom w:val="none" w:sz="0" w:space="0" w:color="000000"/>
-                <w:top w:val="none" w:sz="0" w:space="0" w:color="000000"/>
-                <w:left w:val="none" w:sz="0" w:space="0" w:color="000000"/>
-                <w:right w:val="none" w:sz="0" w:space="0" w:color="000000"/>
-              </w:pBdr>
-              <w:spacing w:after="100" w:before="100" w:line="240"/>
-              <w:ind w:left="100" w:right="100" w:firstLine="0" w:firstLineChars="0"/>
-              <w:rPr>
-                <w:rFonts w:ascii="Helvetica" w:hAnsi="Helvetica" w:eastAsia="Helvetica" w:cs="Helvetica"/>
-                <w:i w:val="false"/>
-                <w:b w:val="false"/>
-                <w:u w:val="none"/>
-                <w:strike w:val="false"/>
-                <w:sz w:val="22"/>
-                <w:szCs w:val="22"/>
-                <w:color w:val="000000"/>
-              </w:rPr>
-            </w:pPr>
-            <w:r>
-              <w:rPr>
-                <w:rFonts w:ascii="Helvetica" w:hAnsi="Helvetica" w:eastAsia="Helvetica" w:cs="Helvetica"/>
-                <w:i w:val="false"/>
-                <w:b w:val="false"/>
-                <w:u w:val="none"/>
-                <w:strike w:val="false"/>
-                <w:sz w:val="22"/>
-                <w:szCs w:val="22"/>
-                <w:color w:val="000000"/>
-              </w:rPr>
-              <w:t xml:space="preserve">+27.4 [-1.1; +51.6]</w:t>
-            </w:r>
-          </w:p>
-        </w:tc>
-      </w:tr>
-      <w:tr>
-        <w:trPr>
-          <w:trHeight w:val="620" w:hRule="auto"/>
-        </w:trPr>
-        body12
-        <w:tc>
-          <w:tcPr>
-            <w:tcBorders>
-              <w:bottom w:val="none" w:sz="0" w:space="0" w:color="000000"/>
-              <w:top w:val="none" w:sz="0" w:space="0" w:color="000000"/>
-              <w:left w:val="none" w:sz="0" w:space="0" w:color="000000"/>
-              <w:right w:val="none" w:sz="0" w:space="0" w:color="000000"/>
-            </w:tcBorders>
-            <w:shd w:val="clear" w:color="auto" w:fill="FFFFFF"/>
-            <w:tcMar>
-              <w:top w:w="0" w:type="dxa"/>
-              <w:bottom w:w="0" w:type="dxa"/>
-              <w:left w:w="0" w:type="dxa"/>
-              <w:right w:w="0" w:type="dxa"/>
-            </w:tcMar>
-            <w:vAlign w:val="center"/>
-          </w:tcPr>
-          <w:p>
-            <w:pPr>
-              <w:jc w:val="left"/>
-              <w:pBdr>
-                <w:bottom w:val="none" w:sz="0" w:space="0" w:color="000000"/>
-                <w:top w:val="none" w:sz="0" w:space="0" w:color="000000"/>
-                <w:left w:val="none" w:sz="0" w:space="0" w:color="000000"/>
-                <w:right w:val="none" w:sz="0" w:space="0" w:color="000000"/>
-              </w:pBdr>
-              <w:spacing w:after="100" w:before="100" w:line="240"/>
-              <w:ind w:left="100" w:right="100" w:firstLine="0" w:firstLineChars="0"/>
-              <w:rPr>
-                <w:rFonts w:ascii="Helvetica" w:hAnsi="Helvetica" w:eastAsia="Helvetica" w:cs="Helvetica"/>
-                <w:i w:val="false"/>
-                <w:b w:val="false"/>
-                <w:u w:val="none"/>
-                <w:strike w:val="false"/>
-                <w:sz w:val="22"/>
-                <w:szCs w:val="22"/>
-                <w:color w:val="000000"/>
-              </w:rPr>
-            </w:pPr>
-            <w:r>
-              <w:rPr>
-                <w:rFonts w:ascii="Helvetica" w:hAnsi="Helvetica" w:eastAsia="Helvetica" w:cs="Helvetica"/>
-                <w:i w:val="false"/>
-                <w:b w:val="false"/>
-                <w:u w:val="none"/>
-                <w:strike w:val="false"/>
-                <w:sz w:val="22"/>
-                <w:szCs w:val="22"/>
-                <w:color w:val="000000"/>
-              </w:rPr>
-              <w:t xml:space="preserve">Bridge to LVAD (%)</w:t>
-            </w:r>
-          </w:p>
-        </w:tc>
-        <w:tc>
-          <w:tcPr>
-            <w:tcBorders>
-              <w:bottom w:val="none" w:sz="0" w:space="0" w:color="000000"/>
-              <w:top w:val="none" w:sz="0" w:space="0" w:color="000000"/>
-              <w:left w:val="none" w:sz="0" w:space="0" w:color="000000"/>
-              <w:right w:val="none" w:sz="0" w:space="0" w:color="000000"/>
-            </w:tcBorders>
-            <w:shd w:val="clear" w:color="auto" w:fill="FFFFFF"/>
-            <w:tcMar>
-              <w:top w:w="0" w:type="dxa"/>
-              <w:bottom w:w="0" w:type="dxa"/>
-              <w:left w:w="0" w:type="dxa"/>
-              <w:right w:w="0" w:type="dxa"/>
-            </w:tcMar>
-            <w:vAlign w:val="center"/>
-          </w:tcPr>
-          <w:p>
-            <w:pPr>
-              <w:jc w:val="center"/>
-              <w:pBdr>
-                <w:bottom w:val="none" w:sz="0" w:space="0" w:color="000000"/>
-                <w:top w:val="none" w:sz="0" w:space="0" w:color="000000"/>
-                <w:left w:val="none" w:sz="0" w:space="0" w:color="000000"/>
-                <w:right w:val="none" w:sz="0" w:space="0" w:color="000000"/>
-              </w:pBdr>
-              <w:spacing w:after="100" w:before="100" w:line="240"/>
-              <w:ind w:left="100" w:right="100" w:firstLine="0" w:firstLineChars="0"/>
-              <w:rPr>
-                <w:rFonts w:ascii="Helvetica" w:hAnsi="Helvetica" w:eastAsia="Helvetica" w:cs="Helvetica"/>
-                <w:i w:val="false"/>
-                <w:b w:val="false"/>
-                <w:u w:val="none"/>
-                <w:strike w:val="false"/>
-                <w:sz w:val="22"/>
-                <w:szCs w:val="22"/>
-                <w:color w:val="000000"/>
-              </w:rPr>
-            </w:pPr>
-            <w:r>
-              <w:rPr>
-                <w:rFonts w:ascii="Helvetica" w:hAnsi="Helvetica" w:eastAsia="Helvetica" w:cs="Helvetica"/>
-                <w:i w:val="false"/>
-                <w:b w:val="false"/>
-                <w:u w:val="none"/>
-                <w:strike w:val="false"/>
-                <w:sz w:val="22"/>
-                <w:szCs w:val="22"/>
-                <w:color w:val="000000"/>
-              </w:rPr>
-              <w:t xml:space="preserve">   2 ( 8.3) </w:t>
-            </w:r>
-          </w:p>
-        </w:tc>
-        <w:tc>
-          <w:tcPr>
-            <w:tcBorders>
-              <w:bottom w:val="none" w:sz="0" w:space="0" w:color="000000"/>
-              <w:top w:val="none" w:sz="0" w:space="0" w:color="000000"/>
-              <w:left w:val="none" w:sz="0" w:space="0" w:color="000000"/>
-              <w:right w:val="none" w:sz="0" w:space="0" w:color="000000"/>
-            </w:tcBorders>
-            <w:shd w:val="clear" w:color="auto" w:fill="FFFFFF"/>
-            <w:tcMar>
-              <w:top w:w="0" w:type="dxa"/>
-              <w:bottom w:w="0" w:type="dxa"/>
-              <w:left w:w="0" w:type="dxa"/>
-              <w:right w:w="0" w:type="dxa"/>
-            </w:tcMar>
-            <w:vAlign w:val="center"/>
-          </w:tcPr>
-          <w:p>
-            <w:pPr>
-              <w:jc w:val="center"/>
-              <w:pBdr>
-                <w:bottom w:val="none" w:sz="0" w:space="0" w:color="000000"/>
-                <w:top w:val="none" w:sz="0" w:space="0" w:color="000000"/>
-                <w:left w:val="none" w:sz="0" w:space="0" w:color="000000"/>
-                <w:right w:val="none" w:sz="0" w:space="0" w:color="000000"/>
-              </w:pBdr>
-              <w:spacing w:after="100" w:before="100" w:line="240"/>
-              <w:ind w:left="100" w:right="100" w:firstLine="0" w:firstLineChars="0"/>
-              <w:rPr>
-                <w:rFonts w:ascii="Helvetica" w:hAnsi="Helvetica" w:eastAsia="Helvetica" w:cs="Helvetica"/>
-                <w:i w:val="false"/>
-                <w:b w:val="false"/>
-                <w:u w:val="none"/>
-                <w:strike w:val="false"/>
-                <w:sz w:val="22"/>
-                <w:szCs w:val="22"/>
-                <w:color w:val="000000"/>
-              </w:rPr>
-            </w:pPr>
-            <w:r>
-              <w:rPr>
-                <w:rFonts w:ascii="Helvetica" w:hAnsi="Helvetica" w:eastAsia="Helvetica" w:cs="Helvetica"/>
-                <w:i w:val="false"/>
-                <w:b w:val="false"/>
-                <w:u w:val="none"/>
-                <w:strike w:val="false"/>
-                <w:sz w:val="22"/>
-                <w:szCs w:val="22"/>
-                <w:color w:val="000000"/>
-              </w:rPr>
-              <w:t xml:space="preserve">   2 ( 8.7) </w:t>
-            </w:r>
-          </w:p>
-        </w:tc>
-        <w:tc>
-          <w:tcPr>
-            <w:tcBorders>
-              <w:bottom w:val="none" w:sz="0" w:space="0" w:color="000000"/>
-              <w:top w:val="none" w:sz="0" w:space="0" w:color="000000"/>
-              <w:left w:val="none" w:sz="0" w:space="0" w:color="000000"/>
-              <w:right w:val="none" w:sz="0" w:space="0" w:color="000000"/>
-            </w:tcBorders>
-            <w:shd w:val="clear" w:color="auto" w:fill="FFFFFF"/>
-            <w:tcMar>
-              <w:top w:w="0" w:type="dxa"/>
-              <w:bottom w:w="0" w:type="dxa"/>
-              <w:left w:w="0" w:type="dxa"/>
-              <w:right w:w="0" w:type="dxa"/>
-            </w:tcMar>
-            <w:vAlign w:val="center"/>
-          </w:tcPr>
-          <w:p>
-            <w:pPr>
-              <w:jc w:val="center"/>
-              <w:pBdr>
-                <w:bottom w:val="none" w:sz="0" w:space="0" w:color="000000"/>
-                <w:top w:val="none" w:sz="0" w:space="0" w:color="000000"/>
-                <w:left w:val="none" w:sz="0" w:space="0" w:color="000000"/>
-                <w:right w:val="none" w:sz="0" w:space="0" w:color="000000"/>
-              </w:pBdr>
-              <w:spacing w:after="100" w:before="100" w:line="240"/>
-              <w:ind w:left="100" w:right="100" w:firstLine="0" w:firstLineChars="0"/>
-              <w:rPr>
-                <w:rFonts w:ascii="Helvetica" w:hAnsi="Helvetica" w:eastAsia="Helvetica" w:cs="Helvetica"/>
-                <w:i w:val="false"/>
-                <w:b w:val="false"/>
-                <w:u w:val="none"/>
-                <w:strike w:val="false"/>
-                <w:sz w:val="22"/>
-                <w:szCs w:val="22"/>
-                <w:color w:val="000000"/>
-              </w:rPr>
-            </w:pPr>
-            <w:r>
-              <w:rPr>
-                <w:rFonts w:ascii="Helvetica" w:hAnsi="Helvetica" w:eastAsia="Helvetica" w:cs="Helvetica"/>
-                <w:i w:val="false"/>
-                <w:b w:val="false"/>
-                <w:u w:val="none"/>
-                <w:strike w:val="false"/>
-                <w:sz w:val="22"/>
-                <w:szCs w:val="22"/>
-                <w:color w:val="000000"/>
-              </w:rPr>
-              <w:t xml:space="preserve">+0.4 [-17.2; +18.2]</w:t>
-            </w:r>
-          </w:p>
-        </w:tc>
-      </w:tr>
-      <w:tr>
-        <w:trPr>
-          <w:trHeight w:val="620" w:hRule="auto"/>
-        </w:trPr>
-        body13
-        <w:tc>
-          <w:tcPr>
-            <w:tcBorders>
-              <w:bottom w:val="none" w:sz="0" w:space="0" w:color="000000"/>
-              <w:top w:val="none" w:sz="0" w:space="0" w:color="000000"/>
-              <w:left w:val="none" w:sz="0" w:space="0" w:color="000000"/>
-              <w:right w:val="none" w:sz="0" w:space="0" w:color="000000"/>
-            </w:tcBorders>
-            <w:shd w:val="clear" w:color="auto" w:fill="FFFFFF"/>
-            <w:tcMar>
-              <w:top w:w="0" w:type="dxa"/>
-              <w:bottom w:w="0" w:type="dxa"/>
-              <w:left w:w="0" w:type="dxa"/>
-              <w:right w:w="0" w:type="dxa"/>
-            </w:tcMar>
-            <w:vAlign w:val="center"/>
-          </w:tcPr>
-          <w:p>
-            <w:pPr>
-              <w:jc w:val="left"/>
-              <w:pBdr>
-                <w:bottom w:val="none" w:sz="0" w:space="0" w:color="000000"/>
-                <w:top w:val="none" w:sz="0" w:space="0" w:color="000000"/>
-                <w:left w:val="none" w:sz="0" w:space="0" w:color="000000"/>
-                <w:right w:val="none" w:sz="0" w:space="0" w:color="000000"/>
-              </w:pBdr>
-              <w:spacing w:after="100" w:before="100" w:line="240"/>
-              <w:ind w:left="100" w:right="100" w:firstLine="0" w:firstLineChars="0"/>
-              <w:rPr>
-                <w:rFonts w:ascii="Helvetica" w:hAnsi="Helvetica" w:eastAsia="Helvetica" w:cs="Helvetica"/>
-                <w:i w:val="false"/>
-                <w:b w:val="false"/>
-                <w:u w:val="none"/>
-                <w:strike w:val="false"/>
-                <w:sz w:val="22"/>
-                <w:szCs w:val="22"/>
-                <w:color w:val="000000"/>
-              </w:rPr>
-            </w:pPr>
-            <w:r>
-              <w:rPr>
-                <w:rFonts w:ascii="Helvetica" w:hAnsi="Helvetica" w:eastAsia="Helvetica" w:cs="Helvetica"/>
-                <w:i w:val="false"/>
-                <w:b w:val="false"/>
-                <w:u w:val="none"/>
-                <w:strike w:val="false"/>
-                <w:sz w:val="22"/>
-                <w:szCs w:val="22"/>
-                <w:color w:val="000000"/>
-              </w:rPr>
-              <w:t xml:space="preserve">Bridge to Transplant (%)</w:t>
-            </w:r>
-          </w:p>
-        </w:tc>
-        <w:tc>
-          <w:tcPr>
-            <w:tcBorders>
-              <w:bottom w:val="none" w:sz="0" w:space="0" w:color="000000"/>
-              <w:top w:val="none" w:sz="0" w:space="0" w:color="000000"/>
-              <w:left w:val="none" w:sz="0" w:space="0" w:color="000000"/>
-              <w:right w:val="none" w:sz="0" w:space="0" w:color="000000"/>
-            </w:tcBorders>
-            <w:shd w:val="clear" w:color="auto" w:fill="FFFFFF"/>
-            <w:tcMar>
-              <w:top w:w="0" w:type="dxa"/>
-              <w:bottom w:w="0" w:type="dxa"/>
-              <w:left w:w="0" w:type="dxa"/>
-              <w:right w:w="0" w:type="dxa"/>
-            </w:tcMar>
-            <w:vAlign w:val="center"/>
-          </w:tcPr>
-          <w:p>
-            <w:pPr>
-              <w:jc w:val="center"/>
-              <w:pBdr>
-                <w:bottom w:val="none" w:sz="0" w:space="0" w:color="000000"/>
-                <w:top w:val="none" w:sz="0" w:space="0" w:color="000000"/>
-                <w:left w:val="none" w:sz="0" w:space="0" w:color="000000"/>
-                <w:right w:val="none" w:sz="0" w:space="0" w:color="000000"/>
-              </w:pBdr>
-              <w:spacing w:after="100" w:before="100" w:line="240"/>
-              <w:ind w:left="100" w:right="100" w:firstLine="0" w:firstLineChars="0"/>
-              <w:rPr>
-                <w:rFonts w:ascii="Helvetica" w:hAnsi="Helvetica" w:eastAsia="Helvetica" w:cs="Helvetica"/>
-                <w:i w:val="false"/>
-                <w:b w:val="false"/>
-                <w:u w:val="none"/>
-                <w:strike w:val="false"/>
-                <w:sz w:val="22"/>
-                <w:szCs w:val="22"/>
-                <w:color w:val="000000"/>
-              </w:rPr>
-            </w:pPr>
-            <w:r>
-              <w:rPr>
-                <w:rFonts w:ascii="Helvetica" w:hAnsi="Helvetica" w:eastAsia="Helvetica" w:cs="Helvetica"/>
-                <w:i w:val="false"/>
-                <w:b w:val="false"/>
-                <w:u w:val="none"/>
-                <w:strike w:val="false"/>
-                <w:sz w:val="22"/>
-                <w:szCs w:val="22"/>
-                <w:color w:val="000000"/>
-              </w:rPr>
-              <w:t xml:space="preserve">   1 ( 4.2) </w:t>
-            </w:r>
-          </w:p>
-        </w:tc>
-        <w:tc>
-          <w:tcPr>
-            <w:tcBorders>
-              <w:bottom w:val="none" w:sz="0" w:space="0" w:color="000000"/>
-              <w:top w:val="none" w:sz="0" w:space="0" w:color="000000"/>
-              <w:left w:val="none" w:sz="0" w:space="0" w:color="000000"/>
-              <w:right w:val="none" w:sz="0" w:space="0" w:color="000000"/>
-            </w:tcBorders>
-            <w:shd w:val="clear" w:color="auto" w:fill="FFFFFF"/>
-            <w:tcMar>
-              <w:top w:w="0" w:type="dxa"/>
-              <w:bottom w:w="0" w:type="dxa"/>
-              <w:left w:w="0" w:type="dxa"/>
-              <w:right w:w="0" w:type="dxa"/>
-            </w:tcMar>
-            <w:vAlign w:val="center"/>
-          </w:tcPr>
-          <w:p>
-            <w:pPr>
-              <w:jc w:val="center"/>
-              <w:pBdr>
-                <w:bottom w:val="none" w:sz="0" w:space="0" w:color="000000"/>
-                <w:top w:val="none" w:sz="0" w:space="0" w:color="000000"/>
-                <w:left w:val="none" w:sz="0" w:space="0" w:color="000000"/>
-                <w:right w:val="none" w:sz="0" w:space="0" w:color="000000"/>
-              </w:pBdr>
-              <w:spacing w:after="100" w:before="100" w:line="240"/>
-              <w:ind w:left="100" w:right="100" w:firstLine="0" w:firstLineChars="0"/>
-              <w:rPr>
-                <w:rFonts w:ascii="Helvetica" w:hAnsi="Helvetica" w:eastAsia="Helvetica" w:cs="Helvetica"/>
-                <w:i w:val="false"/>
-                <w:b w:val="false"/>
-                <w:u w:val="none"/>
-                <w:strike w:val="false"/>
-                <w:sz w:val="22"/>
-                <w:szCs w:val="22"/>
-                <w:color w:val="000000"/>
-              </w:rPr>
-            </w:pPr>
-            <w:r>
-              <w:rPr>
-                <w:rFonts w:ascii="Helvetica" w:hAnsi="Helvetica" w:eastAsia="Helvetica" w:cs="Helvetica"/>
-                <w:i w:val="false"/>
-                <w:b w:val="false"/>
-                <w:u w:val="none"/>
-                <w:strike w:val="false"/>
-                <w:sz w:val="22"/>
-                <w:szCs w:val="22"/>
-                <w:color w:val="000000"/>
-              </w:rPr>
-              <w:t xml:space="preserve">   1 ( 4.3) </w:t>
-            </w:r>
-          </w:p>
-        </w:tc>
-        <w:tc>
-          <w:tcPr>
-            <w:tcBorders>
-              <w:bottom w:val="none" w:sz="0" w:space="0" w:color="000000"/>
-              <w:top w:val="none" w:sz="0" w:space="0" w:color="000000"/>
-              <w:left w:val="none" w:sz="0" w:space="0" w:color="000000"/>
-              <w:right w:val="none" w:sz="0" w:space="0" w:color="000000"/>
-            </w:tcBorders>
-            <w:shd w:val="clear" w:color="auto" w:fill="FFFFFF"/>
-            <w:tcMar>
-              <w:top w:w="0" w:type="dxa"/>
-              <w:bottom w:w="0" w:type="dxa"/>
-              <w:left w:w="0" w:type="dxa"/>
-              <w:right w:w="0" w:type="dxa"/>
-            </w:tcMar>
-            <w:vAlign w:val="center"/>
-          </w:tcPr>
-          <w:p>
-            <w:pPr>
-              <w:jc w:val="center"/>
-              <w:pBdr>
-                <w:bottom w:val="none" w:sz="0" w:space="0" w:color="000000"/>
-                <w:top w:val="none" w:sz="0" w:space="0" w:color="000000"/>
-                <w:left w:val="none" w:sz="0" w:space="0" w:color="000000"/>
-                <w:right w:val="none" w:sz="0" w:space="0" w:color="000000"/>
-              </w:pBdr>
-              <w:spacing w:after="100" w:before="100" w:line="240"/>
-              <w:ind w:left="100" w:right="100" w:firstLine="0" w:firstLineChars="0"/>
-              <w:rPr>
-                <w:rFonts w:ascii="Helvetica" w:hAnsi="Helvetica" w:eastAsia="Helvetica" w:cs="Helvetica"/>
-                <w:i w:val="false"/>
-                <w:b w:val="false"/>
-                <w:u w:val="none"/>
-                <w:strike w:val="false"/>
-                <w:sz w:val="22"/>
-                <w:szCs w:val="22"/>
-                <w:color w:val="000000"/>
-              </w:rPr>
-            </w:pPr>
-            <w:r>
-              <w:rPr>
-                <w:rFonts w:ascii="Helvetica" w:hAnsi="Helvetica" w:eastAsia="Helvetica" w:cs="Helvetica"/>
-                <w:i w:val="false"/>
-                <w:b w:val="false"/>
-                <w:u w:val="none"/>
-                <w:strike w:val="false"/>
-                <w:sz w:val="22"/>
-                <w:szCs w:val="22"/>
-                <w:color w:val="000000"/>
-              </w:rPr>
-              <w:t xml:space="preserve">+0.2 [-14.5; +15.1]</w:t>
-            </w:r>
-          </w:p>
-        </w:tc>
-      </w:tr>
-      <w:tr>
-        <w:trPr>
-          <w:trHeight w:val="621" w:hRule="auto"/>
-        </w:trPr>
-        body14
-        <w:tc>
-          <w:tcPr>
-            <w:tcBorders>
-              <w:bottom w:val="none" w:sz="0" w:space="0" w:color="000000"/>
-              <w:top w:val="none" w:sz="0" w:space="0" w:color="000000"/>
-              <w:left w:val="none" w:sz="0" w:space="0" w:color="000000"/>
-              <w:right w:val="none" w:sz="0" w:space="0" w:color="000000"/>
-            </w:tcBorders>
-            <w:shd w:val="clear" w:color="auto" w:fill="FFFFFF"/>
-            <w:tcMar>
-              <w:top w:w="0" w:type="dxa"/>
-              <w:bottom w:w="0" w:type="dxa"/>
-              <w:left w:w="0" w:type="dxa"/>
-              <w:right w:w="0" w:type="dxa"/>
-            </w:tcMar>
-            <w:vAlign w:val="center"/>
-          </w:tcPr>
-          <w:p>
-            <w:pPr>
-              <w:jc w:val="left"/>
-              <w:pBdr>
-                <w:bottom w:val="none" w:sz="0" w:space="0" w:color="000000"/>
-                <w:top w:val="none" w:sz="0" w:space="0" w:color="000000"/>
-                <w:left w:val="none" w:sz="0" w:space="0" w:color="000000"/>
-                <w:right w:val="none" w:sz="0" w:space="0" w:color="000000"/>
-              </w:pBdr>
-              <w:spacing w:after="100" w:before="100" w:line="240"/>
-              <w:ind w:left="100" w:right="100" w:firstLine="0" w:firstLineChars="0"/>
-              <w:rPr>
-                <w:rFonts w:ascii="Helvetica" w:hAnsi="Helvetica" w:eastAsia="Helvetica" w:cs="Helvetica"/>
-                <w:i w:val="false"/>
-                <w:b w:val="false"/>
-                <w:u w:val="none"/>
-                <w:strike w:val="false"/>
-                <w:sz w:val="22"/>
-                <w:szCs w:val="22"/>
-                <w:color w:val="000000"/>
-              </w:rPr>
-            </w:pPr>
-            <w:r>
-              <w:rPr>
-                <w:rFonts w:ascii="Helvetica" w:hAnsi="Helvetica" w:eastAsia="Helvetica" w:cs="Helvetica"/>
-                <w:i w:val="false"/>
-                <w:b w:val="false"/>
-                <w:u w:val="none"/>
-                <w:strike w:val="false"/>
-                <w:sz w:val="22"/>
-                <w:szCs w:val="22"/>
-                <w:color w:val="000000"/>
-              </w:rPr>
-              <w:t xml:space="preserve">ECMO Weaning (%)</w:t>
-            </w:r>
-          </w:p>
-        </w:tc>
-        <w:tc>
-          <w:tcPr>
-            <w:tcBorders>
-              <w:bottom w:val="none" w:sz="0" w:space="0" w:color="000000"/>
-              <w:top w:val="none" w:sz="0" w:space="0" w:color="000000"/>
-              <w:left w:val="none" w:sz="0" w:space="0" w:color="000000"/>
-              <w:right w:val="none" w:sz="0" w:space="0" w:color="000000"/>
-            </w:tcBorders>
-            <w:shd w:val="clear" w:color="auto" w:fill="FFFFFF"/>
-            <w:tcMar>
-              <w:top w:w="0" w:type="dxa"/>
-              <w:bottom w:w="0" w:type="dxa"/>
-              <w:left w:w="0" w:type="dxa"/>
-              <w:right w:w="0" w:type="dxa"/>
-            </w:tcMar>
-            <w:vAlign w:val="center"/>
-          </w:tcPr>
-          <w:p>
-            <w:pPr>
-              <w:jc w:val="center"/>
-              <w:pBdr>
-                <w:bottom w:val="none" w:sz="0" w:space="0" w:color="000000"/>
-                <w:top w:val="none" w:sz="0" w:space="0" w:color="000000"/>
-                <w:left w:val="none" w:sz="0" w:space="0" w:color="000000"/>
-                <w:right w:val="none" w:sz="0" w:space="0" w:color="000000"/>
-              </w:pBdr>
-              <w:spacing w:after="100" w:before="100" w:line="240"/>
-              <w:ind w:left="100" w:right="100" w:firstLine="0" w:firstLineChars="0"/>
-              <w:rPr>
-                <w:rFonts w:ascii="Helvetica" w:hAnsi="Helvetica" w:eastAsia="Helvetica" w:cs="Helvetica"/>
-                <w:i w:val="false"/>
-                <w:b w:val="false"/>
-                <w:u w:val="none"/>
-                <w:strike w:val="false"/>
-                <w:sz w:val="22"/>
-                <w:szCs w:val="22"/>
-                <w:color w:val="000000"/>
-              </w:rPr>
-            </w:pPr>
-            <w:r>
-              <w:rPr>
-                <w:rFonts w:ascii="Helvetica" w:hAnsi="Helvetica" w:eastAsia="Helvetica" w:cs="Helvetica"/>
-                <w:i w:val="false"/>
-                <w:b w:val="false"/>
-                <w:u w:val="none"/>
-                <w:strike w:val="false"/>
-                <w:sz w:val="22"/>
-                <w:szCs w:val="22"/>
-                <w:color w:val="000000"/>
-              </w:rPr>
-              <w:t xml:space="preserve">  14 (58.3) </w:t>
-            </w:r>
-          </w:p>
-        </w:tc>
-        <w:tc>
-          <w:tcPr>
-            <w:tcBorders>
-              <w:bottom w:val="none" w:sz="0" w:space="0" w:color="000000"/>
-              <w:top w:val="none" w:sz="0" w:space="0" w:color="000000"/>
-              <w:left w:val="none" w:sz="0" w:space="0" w:color="000000"/>
-              <w:right w:val="none" w:sz="0" w:space="0" w:color="000000"/>
-            </w:tcBorders>
-            <w:shd w:val="clear" w:color="auto" w:fill="FFFFFF"/>
-            <w:tcMar>
-              <w:top w:w="0" w:type="dxa"/>
-              <w:bottom w:w="0" w:type="dxa"/>
-              <w:left w:w="0" w:type="dxa"/>
-              <w:right w:w="0" w:type="dxa"/>
-            </w:tcMar>
-            <w:vAlign w:val="center"/>
-          </w:tcPr>
-          <w:p>
-            <w:pPr>
-              <w:jc w:val="center"/>
-              <w:pBdr>
-                <w:bottom w:val="none" w:sz="0" w:space="0" w:color="000000"/>
-                <w:top w:val="none" w:sz="0" w:space="0" w:color="000000"/>
-                <w:left w:val="none" w:sz="0" w:space="0" w:color="000000"/>
-                <w:right w:val="none" w:sz="0" w:space="0" w:color="000000"/>
-              </w:pBdr>
-              <w:spacing w:after="100" w:before="100" w:line="240"/>
-              <w:ind w:left="100" w:right="100" w:firstLine="0" w:firstLineChars="0"/>
-              <w:rPr>
-                <w:rFonts w:ascii="Helvetica" w:hAnsi="Helvetica" w:eastAsia="Helvetica" w:cs="Helvetica"/>
-                <w:i w:val="false"/>
-                <w:b w:val="false"/>
-                <w:u w:val="none"/>
-                <w:strike w:val="false"/>
-                <w:sz w:val="22"/>
-                <w:szCs w:val="22"/>
-                <w:color w:val="000000"/>
-              </w:rPr>
-            </w:pPr>
-            <w:r>
-              <w:rPr>
-                <w:rFonts w:ascii="Helvetica" w:hAnsi="Helvetica" w:eastAsia="Helvetica" w:cs="Helvetica"/>
-                <w:i w:val="false"/>
-                <w:b w:val="false"/>
-                <w:u w:val="none"/>
-                <w:strike w:val="false"/>
-                <w:sz w:val="22"/>
-                <w:szCs w:val="22"/>
-                <w:color w:val="000000"/>
-              </w:rPr>
-              <w:t xml:space="preserve">   7 (30.4) </w:t>
-            </w:r>
-          </w:p>
-        </w:tc>
-        <w:tc>
-          <w:tcPr>
-            <w:tcBorders>
-              <w:bottom w:val="none" w:sz="0" w:space="0" w:color="000000"/>
-              <w:top w:val="none" w:sz="0" w:space="0" w:color="000000"/>
-              <w:left w:val="none" w:sz="0" w:space="0" w:color="000000"/>
-              <w:right w:val="none" w:sz="0" w:space="0" w:color="000000"/>
-            </w:tcBorders>
-            <w:shd w:val="clear" w:color="auto" w:fill="FFFFFF"/>
-            <w:tcMar>
-              <w:top w:w="0" w:type="dxa"/>
-              <w:bottom w:w="0" w:type="dxa"/>
-              <w:left w:w="0" w:type="dxa"/>
-              <w:right w:w="0" w:type="dxa"/>
-            </w:tcMar>
-            <w:vAlign w:val="center"/>
-          </w:tcPr>
-          <w:p>
-            <w:pPr>
-              <w:jc w:val="center"/>
-              <w:pBdr>
-                <w:bottom w:val="none" w:sz="0" w:space="0" w:color="000000"/>
-                <w:top w:val="none" w:sz="0" w:space="0" w:color="000000"/>
-                <w:left w:val="none" w:sz="0" w:space="0" w:color="000000"/>
-                <w:right w:val="none" w:sz="0" w:space="0" w:color="000000"/>
-              </w:pBdr>
-              <w:spacing w:after="100" w:before="100" w:line="240"/>
-              <w:ind w:left="100" w:right="100" w:firstLine="0" w:firstLineChars="0"/>
-              <w:rPr>
-                <w:rFonts w:ascii="Helvetica" w:hAnsi="Helvetica" w:eastAsia="Helvetica" w:cs="Helvetica"/>
-                <w:i w:val="false"/>
-                <w:b w:val="false"/>
-                <w:u w:val="none"/>
-                <w:strike w:val="false"/>
-                <w:sz w:val="22"/>
-                <w:szCs w:val="22"/>
-                <w:color w:val="000000"/>
-              </w:rPr>
-            </w:pPr>
-            <w:r>
-              <w:rPr>
-                <w:rFonts w:ascii="Helvetica" w:hAnsi="Helvetica" w:eastAsia="Helvetica" w:cs="Helvetica"/>
-                <w:i w:val="false"/>
-                <w:b w:val="false"/>
-                <w:u w:val="none"/>
-                <w:strike w:val="false"/>
-                <w:sz w:val="22"/>
-                <w:szCs w:val="22"/>
-                <w:color w:val="000000"/>
-              </w:rPr>
-              <w:t xml:space="preserve">-27.9 [-52.1; +0.7]</w:t>
             </w:r>
           </w:p>
         </w:tc>
@@ -3426,7 +3426,7 @@
                 <w:szCs w:val="22"/>
                 <w:color w:val="000000"/>
               </w:rPr>
-              <w:t xml:space="preserve">28-day Mortality (%)</w:t>
+              <w:t xml:space="preserve">Renal Replacement Therapy (%)</w:t>
             </w:r>
           </w:p>
         </w:tc>
@@ -3480,7 +3480,7 @@
                 <w:szCs w:val="22"/>
                 <w:color w:val="000000"/>
               </w:rPr>
-              <w:t xml:space="preserve">   8 (33.3) </w:t>
+              <w:t xml:space="preserve">   2 (20) </w:t>
             </w:r>
           </w:p>
         </w:tc>
@@ -3534,7 +3534,7 @@
                 <w:szCs w:val="22"/>
                 <w:color w:val="000000"/>
               </w:rPr>
-              <w:t xml:space="preserve">  14 (60.9) </w:t>
+              <w:t xml:space="preserve">   5 (46) </w:t>
             </w:r>
           </w:p>
         </w:tc>
@@ -3588,14 +3588,14 @@
                 <w:szCs w:val="22"/>
                 <w:color w:val="000000"/>
               </w:rPr>
-              <w:t xml:space="preserve">+27.5 [-1.1; +51.9]</w:t>
+              <w:t xml:space="preserve">+26 [-15 - +58]</w:t>
             </w:r>
           </w:p>
         </w:tc>
       </w:tr>
       <w:tr>
         <w:trPr>
-          <w:trHeight w:val="618" w:hRule="auto"/>
+          <w:trHeight w:val="569" w:hRule="auto"/>
         </w:trPr>
         body16
         <w:tc>
@@ -3648,7 +3648,7 @@
                 <w:szCs w:val="22"/>
                 <w:color w:val="000000"/>
               </w:rPr>
-              <w:t xml:space="preserve">90-day Mortality (%)</w:t>
+              <w:t xml:space="preserve">n</w:t>
             </w:r>
           </w:p>
         </w:tc>
@@ -3702,7 +3702,7 @@
                 <w:szCs w:val="22"/>
                 <w:color w:val="000000"/>
               </w:rPr>
-              <w:t xml:space="preserve">  11 (45.8) </w:t>
+              <w:t xml:space="preserve">  24</w:t>
             </w:r>
           </w:p>
         </w:tc>
@@ -3756,7 +3756,7 @@
                 <w:szCs w:val="22"/>
                 <w:color w:val="000000"/>
               </w:rPr>
-              <w:t xml:space="preserve">  16 (69.6) </w:t>
+              <w:t xml:space="preserve">  23</w:t>
             </w:r>
           </w:p>
         </w:tc>
@@ -3810,7 +3810,7 @@
                 <w:szCs w:val="22"/>
                 <w:color w:val="000000"/>
               </w:rPr>
-              <w:t xml:space="preserve">+23.7 [-4.6; +48.3]</w:t>
+              <w:t xml:space="preserve">NA</w:t>
             </w:r>
           </w:p>
         </w:tc>

</xml_diff>